<commit_message>
Rapport v3.2: agency manager -> Operations manager Melanie Oksjö
Endringer:
- Takk til: "agency manager" -> "Operations manager Melanie Oksjö"
- § 9.5 (brukertest): "agency-manageren" -> "Operations manager"
- § 9.5.6: "Manageren spurte" -> "Operations manager spurte"

Ordtelling: 11 999 ord (1 under 12 000-grensen). 53 sider.

Co-Authored-By: Claude Opus 4.7 <noreply@anthropic.com>
</commit_message>
<xml_diff>
--- a/014 fase 4 - report/Final report draft.docx
+++ b/014 fase 4 - report/Final report draft.docx
@@ -14,7 +14,7 @@
           <w:noProof/>
         </w:rPr>
         <w:drawing>
-          <wp:inline distT="0" distB="0" distL="0" distR="0" wp14:anchorId="76E63463" wp14:editId="7874A137">
+          <wp:inline distT="0" distB="0" distL="0" distR="0" wp14:anchorId="1A4032ED" wp14:editId="2BEE7E0C">
             <wp:extent cx="1439999" cy="1439999"/>
             <wp:effectExtent l="0" t="0" r="0" b="0"/>
             <wp:docPr id="10" name="Picture"/>
@@ -191,7 +191,7 @@
         <w:pStyle w:val="Overskrift2"/>
       </w:pPr>
       <w:bookmarkStart w:id="1" w:name="obligatorisk-egenerklæring"/>
-      <w:bookmarkStart w:id="2" w:name="_Toc230678410"/>
+      <w:bookmarkStart w:id="2" w:name="_Toc230678976"/>
       <w:r>
         <w:t>Obligatorisk egenerklæring</w:t>
       </w:r>
@@ -503,7 +503,7 @@
         <w:rPr>
           <w:rFonts w:eastAsia="Times New Roman" w:cs="Times New Roman"/>
         </w:rPr>
-        <w:pict w14:anchorId="2D59A083">
+        <w:pict w14:anchorId="776664ED">
           <v:rect id="_x0000_i1025" style="width:0;height:1.5pt" o:hralign="center" o:hrstd="t" o:hr="t"/>
         </w:pict>
       </w:r>
@@ -513,7 +513,7 @@
         <w:pStyle w:val="Overskrift2"/>
       </w:pPr>
       <w:bookmarkStart w:id="3" w:name="sammendrag"/>
-      <w:bookmarkStart w:id="4" w:name="_Toc230678411"/>
+      <w:bookmarkStart w:id="4" w:name="_Toc230678977"/>
       <w:bookmarkEnd w:id="1"/>
       <w:r>
         <w:t>Sammendrag</w:t>
@@ -630,7 +630,7 @@
         <w:rPr>
           <w:rFonts w:eastAsia="Times New Roman" w:cs="Times New Roman"/>
         </w:rPr>
-        <w:pict w14:anchorId="626F79DC">
+        <w:pict w14:anchorId="2E3ADEBF">
           <v:rect id="_x0000_i1026" style="width:0;height:1.5pt" o:hralign="center" o:hrstd="t" o:hr="t"/>
         </w:pict>
       </w:r>
@@ -640,7 +640,7 @@
         <w:pStyle w:val="Overskrift2"/>
       </w:pPr>
       <w:bookmarkStart w:id="5" w:name="abstract"/>
-      <w:bookmarkStart w:id="6" w:name="_Toc230678412"/>
+      <w:bookmarkStart w:id="6" w:name="_Toc230678978"/>
       <w:bookmarkEnd w:id="3"/>
       <w:r>
         <w:t>Abstract</w:t>
@@ -749,7 +749,7 @@
         <w:rPr>
           <w:rFonts w:eastAsia="Times New Roman" w:cs="Times New Roman"/>
         </w:rPr>
-        <w:pict w14:anchorId="69A2D692">
+        <w:pict w14:anchorId="23800899">
           <v:rect id="_x0000_i1027" style="width:0;height:1.5pt" o:hralign="center" o:hrstd="t" o:hr="t"/>
         </w:pict>
       </w:r>
@@ -759,7 +759,7 @@
         <w:pStyle w:val="Overskrift2"/>
       </w:pPr>
       <w:bookmarkStart w:id="7" w:name="takk-til"/>
-      <w:bookmarkStart w:id="8" w:name="_Toc230678413"/>
+      <w:bookmarkStart w:id="8" w:name="_Toc230678979"/>
       <w:bookmarkEnd w:id="5"/>
       <w:r>
         <w:t>Takk til</w:t>
@@ -796,28 +796,7 @@
           <w:rFonts w:eastAsia="Times New Roman" w:cs="Times New Roman"/>
         </w:rPr>
         <w:softHyphen/>
-        <w:t xml:space="preserve">spesifikasjoner som danner studiens testsett, og til </w:t>
-      </w:r>
-      <w:r>
-        <w:rPr>
-          <w:rFonts w:eastAsia="Times New Roman" w:cs="Times New Roman"/>
-          <w:i/>
-          <w:iCs/>
-        </w:rPr>
-        <w:t>agency manager</w:t>
-      </w:r>
-      <w:r>
-        <w:rPr>
-          <w:rFonts w:eastAsia="Times New Roman" w:cs="Times New Roman"/>
-        </w:rPr>
-        <w:t xml:space="preserve"> for brukertesten i mai 2026 — funnene i § 9.5 hadde ikke vært mulige uten dialogen. Reelle fakturaer for 2020–2024 var ikke tilgjengelige fra bedriften; disse årene er representert ved simulerte transaksjoner som speiler case-strukturen, slik at modellen får tilstrekkelig tids</w:t>
-      </w:r>
-      <w:r>
-        <w:rPr>
-          <w:rFonts w:eastAsia="Times New Roman" w:cs="Times New Roman"/>
-        </w:rPr>
-        <w:softHyphen/>
-        <w:t xml:space="preserve">dybde til trening og validering (jf. § 5.2). Takk til veilederne </w:t>
+        <w:t xml:space="preserve">spesifikasjoner som danner studiens testsett, og til Operations manager </w:t>
       </w:r>
       <w:r>
         <w:rPr>
@@ -825,13 +804,20 @@
           <w:b/>
           <w:bCs/>
         </w:rPr>
-        <w:t>Bård Inge Pettersen</w:t>
-      </w:r>
-      <w:r>
-        <w:rPr>
-          <w:rFonts w:eastAsia="Times New Roman" w:cs="Times New Roman"/>
-        </w:rPr>
-        <w:t xml:space="preserve">, </w:t>
+        <w:t>Melanie Oksjö</w:t>
+      </w:r>
+      <w:r>
+        <w:rPr>
+          <w:rFonts w:eastAsia="Times New Roman" w:cs="Times New Roman"/>
+        </w:rPr>
+        <w:t xml:space="preserve"> for brukertesten i mai 2026 — funnene i § 9.5 hadde ikke vært mulige uten dialogen. Reelle fakturaer for 2020–2024 var ikke tilgjengelige fra bedriften; disse årene er representert ved simulerte transaksjoner som speiler case-strukturen, slik at modellen får tilstrekkelig tids</w:t>
+      </w:r>
+      <w:r>
+        <w:rPr>
+          <w:rFonts w:eastAsia="Times New Roman" w:cs="Times New Roman"/>
+        </w:rPr>
+        <w:softHyphen/>
+        <w:t xml:space="preserve">dybde til trening og validering (jf. § 5.2). Takk til veilederne </w:t>
       </w:r>
       <w:r>
         <w:rPr>
@@ -839,7 +825,13 @@
           <w:b/>
           <w:bCs/>
         </w:rPr>
-        <w:t>Per Kristian Rekda</w:t>
+        <w:t>Bård Inge Pettersen</w:t>
+      </w:r>
+      <w:r>
+        <w:rPr>
+          <w:rFonts w:eastAsia="Times New Roman" w:cs="Times New Roman"/>
+        </w:rPr>
+        <w:t xml:space="preserve">, </w:t>
       </w:r>
       <w:r>
         <w:rPr>
@@ -847,7 +839,7 @@
           <w:b/>
           <w:bCs/>
         </w:rPr>
-        <w:t>l</w:t>
+        <w:t>Per Kristian Rekdal</w:t>
       </w:r>
       <w:r>
         <w:rPr>
@@ -1038,7 +1030,7 @@
         <w:pStyle w:val="Overskrift2"/>
       </w:pPr>
       <w:bookmarkStart w:id="9" w:name="innholdsfortegnelse"/>
-      <w:bookmarkStart w:id="10" w:name="_Toc230678414"/>
+      <w:bookmarkStart w:id="10" w:name="_Toc230678980"/>
       <w:bookmarkEnd w:id="7"/>
       <w:r>
         <w:t>Innholdsfortegnelse</w:t>
@@ -1077,7 +1069,7 @@
         </w:rPr>
         <w:fldChar w:fldCharType="separate"/>
       </w:r>
-      <w:hyperlink w:anchor="_Toc230678410" w:history="1">
+      <w:hyperlink w:anchor="_Toc230678976" w:history="1">
         <w:r>
           <w:rPr>
             <w:rStyle w:val="Hyperkobling"/>
@@ -1104,7 +1096,7 @@
             <w:noProof/>
             <w:webHidden/>
           </w:rPr>
-          <w:instrText xml:space="preserve"> PAGEREF _Toc230678410 \h </w:instrText>
+          <w:instrText xml:space="preserve"> PAGEREF _Toc230678976 \h </w:instrText>
         </w:r>
         <w:r>
           <w:rPr>
@@ -1149,7 +1141,7 @@
           <w14:ligatures w14:val="standardContextual"/>
         </w:rPr>
       </w:pPr>
-      <w:hyperlink w:anchor="_Toc230678411" w:history="1">
+      <w:hyperlink w:anchor="_Toc230678977" w:history="1">
         <w:r>
           <w:rPr>
             <w:rStyle w:val="Hyperkobling"/>
@@ -1176,7 +1168,7 @@
             <w:noProof/>
             <w:webHidden/>
           </w:rPr>
-          <w:instrText xml:space="preserve"> PAGEREF _Toc230678411 \h </w:instrText>
+          <w:instrText xml:space="preserve"> PAGEREF _Toc230678977 \h </w:instrText>
         </w:r>
         <w:r>
           <w:rPr>
@@ -1221,7 +1213,7 @@
           <w14:ligatures w14:val="standardContextual"/>
         </w:rPr>
       </w:pPr>
-      <w:hyperlink w:anchor="_Toc230678412" w:history="1">
+      <w:hyperlink w:anchor="_Toc230678978" w:history="1">
         <w:r>
           <w:rPr>
             <w:rStyle w:val="Hyperkobling"/>
@@ -1248,7 +1240,7 @@
             <w:noProof/>
             <w:webHidden/>
           </w:rPr>
-          <w:instrText xml:space="preserve"> PAGEREF _Toc230678412 \h </w:instrText>
+          <w:instrText xml:space="preserve"> PAGEREF _Toc230678978 \h </w:instrText>
         </w:r>
         <w:r>
           <w:rPr>
@@ -1293,7 +1285,7 @@
           <w14:ligatures w14:val="standardContextual"/>
         </w:rPr>
       </w:pPr>
-      <w:hyperlink w:anchor="_Toc230678413" w:history="1">
+      <w:hyperlink w:anchor="_Toc230678979" w:history="1">
         <w:r>
           <w:rPr>
             <w:rStyle w:val="Hyperkobling"/>
@@ -1320,7 +1312,7 @@
             <w:noProof/>
             <w:webHidden/>
           </w:rPr>
-          <w:instrText xml:space="preserve"> PAGEREF _Toc230678413 \h </w:instrText>
+          <w:instrText xml:space="preserve"> PAGEREF _Toc230678979 \h </w:instrText>
         </w:r>
         <w:r>
           <w:rPr>
@@ -1365,7 +1357,7 @@
           <w14:ligatures w14:val="standardContextual"/>
         </w:rPr>
       </w:pPr>
-      <w:hyperlink w:anchor="_Toc230678414" w:history="1">
+      <w:hyperlink w:anchor="_Toc230678980" w:history="1">
         <w:r>
           <w:rPr>
             <w:rStyle w:val="Hyperkobling"/>
@@ -1392,7 +1384,7 @@
             <w:noProof/>
             <w:webHidden/>
           </w:rPr>
-          <w:instrText xml:space="preserve"> PAGEREF _Toc230678414 \h </w:instrText>
+          <w:instrText xml:space="preserve"> PAGEREF _Toc230678980 \h </w:instrText>
         </w:r>
         <w:r>
           <w:rPr>
@@ -1437,7 +1429,7 @@
           <w14:ligatures w14:val="standardContextual"/>
         </w:rPr>
       </w:pPr>
-      <w:hyperlink w:anchor="_Toc230678415" w:history="1">
+      <w:hyperlink w:anchor="_Toc230678981" w:history="1">
         <w:r>
           <w:rPr>
             <w:rStyle w:val="Hyperkobling"/>
@@ -1464,7 +1456,7 @@
             <w:noProof/>
             <w:webHidden/>
           </w:rPr>
-          <w:instrText xml:space="preserve"> PAGEREF _Toc230678415 \h </w:instrText>
+          <w:instrText xml:space="preserve"> PAGEREF _Toc230678981 \h </w:instrText>
         </w:r>
         <w:r>
           <w:rPr>
@@ -1509,7 +1501,7 @@
           <w14:ligatures w14:val="standardContextual"/>
         </w:rPr>
       </w:pPr>
-      <w:hyperlink w:anchor="_Toc230678416" w:history="1">
+      <w:hyperlink w:anchor="_Toc230678982" w:history="1">
         <w:r>
           <w:rPr>
             <w:rStyle w:val="Hyperkobling"/>
@@ -1536,7 +1528,7 @@
             <w:noProof/>
             <w:webHidden/>
           </w:rPr>
-          <w:instrText xml:space="preserve"> PAGEREF _Toc230678416 \h </w:instrText>
+          <w:instrText xml:space="preserve"> PAGEREF _Toc230678982 \h </w:instrText>
         </w:r>
         <w:r>
           <w:rPr>
@@ -1581,7 +1573,7 @@
           <w14:ligatures w14:val="standardContextual"/>
         </w:rPr>
       </w:pPr>
-      <w:hyperlink w:anchor="_Toc230678417" w:history="1">
+      <w:hyperlink w:anchor="_Toc230678983" w:history="1">
         <w:r>
           <w:rPr>
             <w:rStyle w:val="Hyperkobling"/>
@@ -1608,7 +1600,7 @@
             <w:noProof/>
             <w:webHidden/>
           </w:rPr>
-          <w:instrText xml:space="preserve"> PAGEREF _Toc230678417 \h </w:instrText>
+          <w:instrText xml:space="preserve"> PAGEREF _Toc230678983 \h </w:instrText>
         </w:r>
         <w:r>
           <w:rPr>
@@ -1653,7 +1645,7 @@
           <w14:ligatures w14:val="standardContextual"/>
         </w:rPr>
       </w:pPr>
-      <w:hyperlink w:anchor="_Toc230678418" w:history="1">
+      <w:hyperlink w:anchor="_Toc230678984" w:history="1">
         <w:r>
           <w:rPr>
             <w:rStyle w:val="Hyperkobling"/>
@@ -1680,7 +1672,7 @@
             <w:noProof/>
             <w:webHidden/>
           </w:rPr>
-          <w:instrText xml:space="preserve"> PAGEREF _Toc230678418 \h </w:instrText>
+          <w:instrText xml:space="preserve"> PAGEREF _Toc230678984 \h </w:instrText>
         </w:r>
         <w:r>
           <w:rPr>
@@ -1725,7 +1717,7 @@
           <w14:ligatures w14:val="standardContextual"/>
         </w:rPr>
       </w:pPr>
-      <w:hyperlink w:anchor="_Toc230678419" w:history="1">
+      <w:hyperlink w:anchor="_Toc230678985" w:history="1">
         <w:r>
           <w:rPr>
             <w:rStyle w:val="Hyperkobling"/>
@@ -1752,7 +1744,7 @@
             <w:noProof/>
             <w:webHidden/>
           </w:rPr>
-          <w:instrText xml:space="preserve"> PAGEREF _Toc230678419 \h </w:instrText>
+          <w:instrText xml:space="preserve"> PAGEREF _Toc230678985 \h </w:instrText>
         </w:r>
         <w:r>
           <w:rPr>
@@ -1797,7 +1789,7 @@
           <w14:ligatures w14:val="standardContextual"/>
         </w:rPr>
       </w:pPr>
-      <w:hyperlink w:anchor="_Toc230678420" w:history="1">
+      <w:hyperlink w:anchor="_Toc230678986" w:history="1">
         <w:r>
           <w:rPr>
             <w:rStyle w:val="Hyperkobling"/>
@@ -1824,7 +1816,7 @@
             <w:noProof/>
             <w:webHidden/>
           </w:rPr>
-          <w:instrText xml:space="preserve"> PAGEREF _Toc230678420 \h </w:instrText>
+          <w:instrText xml:space="preserve"> PAGEREF _Toc230678986 \h </w:instrText>
         </w:r>
         <w:r>
           <w:rPr>
@@ -1869,7 +1861,7 @@
           <w14:ligatures w14:val="standardContextual"/>
         </w:rPr>
       </w:pPr>
-      <w:hyperlink w:anchor="_Toc230678421" w:history="1">
+      <w:hyperlink w:anchor="_Toc230678987" w:history="1">
         <w:r>
           <w:rPr>
             <w:rStyle w:val="Hyperkobling"/>
@@ -1896,7 +1888,7 @@
             <w:noProof/>
             <w:webHidden/>
           </w:rPr>
-          <w:instrText xml:space="preserve"> PAGEREF _Toc230678421 \h </w:instrText>
+          <w:instrText xml:space="preserve"> PAGEREF _Toc230678987 \h </w:instrText>
         </w:r>
         <w:r>
           <w:rPr>
@@ -1941,7 +1933,7 @@
           <w14:ligatures w14:val="standardContextual"/>
         </w:rPr>
       </w:pPr>
-      <w:hyperlink w:anchor="_Toc230678422" w:history="1">
+      <w:hyperlink w:anchor="_Toc230678988" w:history="1">
         <w:r>
           <w:rPr>
             <w:rStyle w:val="Hyperkobling"/>
@@ -1968,7 +1960,7 @@
             <w:noProof/>
             <w:webHidden/>
           </w:rPr>
-          <w:instrText xml:space="preserve"> PAGEREF _Toc230678422 \h </w:instrText>
+          <w:instrText xml:space="preserve"> PAGEREF _Toc230678988 \h </w:instrText>
         </w:r>
         <w:r>
           <w:rPr>
@@ -2013,7 +2005,7 @@
           <w14:ligatures w14:val="standardContextual"/>
         </w:rPr>
       </w:pPr>
-      <w:hyperlink w:anchor="_Toc230678423" w:history="1">
+      <w:hyperlink w:anchor="_Toc230678989" w:history="1">
         <w:r>
           <w:rPr>
             <w:rStyle w:val="Hyperkobling"/>
@@ -2040,7 +2032,7 @@
             <w:noProof/>
             <w:webHidden/>
           </w:rPr>
-          <w:instrText xml:space="preserve"> PAGEREF _Toc230678423 \h </w:instrText>
+          <w:instrText xml:space="preserve"> PAGEREF _Toc230678989 \h </w:instrText>
         </w:r>
         <w:r>
           <w:rPr>
@@ -2085,7 +2077,7 @@
           <w14:ligatures w14:val="standardContextual"/>
         </w:rPr>
       </w:pPr>
-      <w:hyperlink w:anchor="_Toc230678424" w:history="1">
+      <w:hyperlink w:anchor="_Toc230678990" w:history="1">
         <w:r>
           <w:rPr>
             <w:rStyle w:val="Hyperkobling"/>
@@ -2112,7 +2104,7 @@
             <w:noProof/>
             <w:webHidden/>
           </w:rPr>
-          <w:instrText xml:space="preserve"> PAGEREF _Toc230678424 \h </w:instrText>
+          <w:instrText xml:space="preserve"> PAGEREF _Toc230678990 \h </w:instrText>
         </w:r>
         <w:r>
           <w:rPr>
@@ -2157,7 +2149,7 @@
           <w14:ligatures w14:val="standardContextual"/>
         </w:rPr>
       </w:pPr>
-      <w:hyperlink w:anchor="_Toc230678425" w:history="1">
+      <w:hyperlink w:anchor="_Toc230678991" w:history="1">
         <w:r>
           <w:rPr>
             <w:rStyle w:val="Hyperkobling"/>
@@ -2184,7 +2176,7 @@
             <w:noProof/>
             <w:webHidden/>
           </w:rPr>
-          <w:instrText xml:space="preserve"> PAGEREF _Toc230678425 \h </w:instrText>
+          <w:instrText xml:space="preserve"> PAGEREF _Toc230678991 \h </w:instrText>
         </w:r>
         <w:r>
           <w:rPr>
@@ -2229,7 +2221,7 @@
           <w14:ligatures w14:val="standardContextual"/>
         </w:rPr>
       </w:pPr>
-      <w:hyperlink w:anchor="_Toc230678426" w:history="1">
+      <w:hyperlink w:anchor="_Toc230678992" w:history="1">
         <w:r>
           <w:rPr>
             <w:rStyle w:val="Hyperkobling"/>
@@ -2256,7 +2248,7 @@
             <w:noProof/>
             <w:webHidden/>
           </w:rPr>
-          <w:instrText xml:space="preserve"> PAGEREF _Toc230678426 \h </w:instrText>
+          <w:instrText xml:space="preserve"> PAGEREF _Toc230678992 \h </w:instrText>
         </w:r>
         <w:r>
           <w:rPr>
@@ -2301,7 +2293,7 @@
           <w14:ligatures w14:val="standardContextual"/>
         </w:rPr>
       </w:pPr>
-      <w:hyperlink w:anchor="_Toc230678427" w:history="1">
+      <w:hyperlink w:anchor="_Toc230678993" w:history="1">
         <w:r>
           <w:rPr>
             <w:rStyle w:val="Hyperkobling"/>
@@ -2328,7 +2320,7 @@
             <w:noProof/>
             <w:webHidden/>
           </w:rPr>
-          <w:instrText xml:space="preserve"> PAGEREF _Toc230678427 \h </w:instrText>
+          <w:instrText xml:space="preserve"> PAGEREF _Toc230678993 \h </w:instrText>
         </w:r>
         <w:r>
           <w:rPr>
@@ -2373,7 +2365,7 @@
           <w14:ligatures w14:val="standardContextual"/>
         </w:rPr>
       </w:pPr>
-      <w:hyperlink w:anchor="_Toc230678428" w:history="1">
+      <w:hyperlink w:anchor="_Toc230678994" w:history="1">
         <w:r>
           <w:rPr>
             <w:rStyle w:val="Hyperkobling"/>
@@ -2400,7 +2392,7 @@
             <w:noProof/>
             <w:webHidden/>
           </w:rPr>
-          <w:instrText xml:space="preserve"> PAGEREF _Toc230678428 \h </w:instrText>
+          <w:instrText xml:space="preserve"> PAGEREF _Toc230678994 \h </w:instrText>
         </w:r>
         <w:r>
           <w:rPr>
@@ -2445,7 +2437,7 @@
           <w14:ligatures w14:val="standardContextual"/>
         </w:rPr>
       </w:pPr>
-      <w:hyperlink w:anchor="_Toc230678429" w:history="1">
+      <w:hyperlink w:anchor="_Toc230678995" w:history="1">
         <w:r>
           <w:rPr>
             <w:rStyle w:val="Hyperkobling"/>
@@ -2472,7 +2464,7 @@
             <w:noProof/>
             <w:webHidden/>
           </w:rPr>
-          <w:instrText xml:space="preserve"> PAGEREF _Toc230678429 \h </w:instrText>
+          <w:instrText xml:space="preserve"> PAGEREF _Toc230678995 \h </w:instrText>
         </w:r>
         <w:r>
           <w:rPr>
@@ -2517,7 +2509,7 @@
           <w14:ligatures w14:val="standardContextual"/>
         </w:rPr>
       </w:pPr>
-      <w:hyperlink w:anchor="_Toc230678430" w:history="1">
+      <w:hyperlink w:anchor="_Toc230678996" w:history="1">
         <w:r>
           <w:rPr>
             <w:rStyle w:val="Hyperkobling"/>
@@ -2544,7 +2536,7 @@
             <w:noProof/>
             <w:webHidden/>
           </w:rPr>
-          <w:instrText xml:space="preserve"> PAGEREF _Toc230678430 \h </w:instrText>
+          <w:instrText xml:space="preserve"> PAGEREF _Toc230678996 \h </w:instrText>
         </w:r>
         <w:r>
           <w:rPr>
@@ -2589,7 +2581,7 @@
           <w14:ligatures w14:val="standardContextual"/>
         </w:rPr>
       </w:pPr>
-      <w:hyperlink w:anchor="_Toc230678431" w:history="1">
+      <w:hyperlink w:anchor="_Toc230678997" w:history="1">
         <w:r>
           <w:rPr>
             <w:rStyle w:val="Hyperkobling"/>
@@ -2616,7 +2608,7 @@
             <w:noProof/>
             <w:webHidden/>
           </w:rPr>
-          <w:instrText xml:space="preserve"> PAGEREF _Toc230678431 \h </w:instrText>
+          <w:instrText xml:space="preserve"> PAGEREF _Toc230678997 \h </w:instrText>
         </w:r>
         <w:r>
           <w:rPr>
@@ -2661,7 +2653,7 @@
           <w14:ligatures w14:val="standardContextual"/>
         </w:rPr>
       </w:pPr>
-      <w:hyperlink w:anchor="_Toc230678432" w:history="1">
+      <w:hyperlink w:anchor="_Toc230678998" w:history="1">
         <w:r>
           <w:rPr>
             <w:rStyle w:val="Hyperkobling"/>
@@ -2688,7 +2680,7 @@
             <w:noProof/>
             <w:webHidden/>
           </w:rPr>
-          <w:instrText xml:space="preserve"> PAGEREF _Toc230678432 \h </w:instrText>
+          <w:instrText xml:space="preserve"> PAGEREF _Toc230678998 \h </w:instrText>
         </w:r>
         <w:r>
           <w:rPr>
@@ -2733,7 +2725,7 @@
           <w14:ligatures w14:val="standardContextual"/>
         </w:rPr>
       </w:pPr>
-      <w:hyperlink w:anchor="_Toc230678433" w:history="1">
+      <w:hyperlink w:anchor="_Toc230678999" w:history="1">
         <w:r>
           <w:rPr>
             <w:rStyle w:val="Hyperkobling"/>
@@ -2760,7 +2752,7 @@
             <w:noProof/>
             <w:webHidden/>
           </w:rPr>
-          <w:instrText xml:space="preserve"> PAGEREF _Toc230678433 \h </w:instrText>
+          <w:instrText xml:space="preserve"> PAGEREF _Toc230678999 \h </w:instrText>
         </w:r>
         <w:r>
           <w:rPr>
@@ -2805,7 +2797,7 @@
           <w14:ligatures w14:val="standardContextual"/>
         </w:rPr>
       </w:pPr>
-      <w:hyperlink w:anchor="_Toc230678434" w:history="1">
+      <w:hyperlink w:anchor="_Toc230679000" w:history="1">
         <w:r>
           <w:rPr>
             <w:rStyle w:val="Hyperkobling"/>
@@ -2832,7 +2824,7 @@
             <w:noProof/>
             <w:webHidden/>
           </w:rPr>
-          <w:instrText xml:space="preserve"> PAGEREF _Toc230678434 \h </w:instrText>
+          <w:instrText xml:space="preserve"> PAGEREF _Toc230679000 \h </w:instrText>
         </w:r>
         <w:r>
           <w:rPr>
@@ -2877,7 +2869,7 @@
           <w14:ligatures w14:val="standardContextual"/>
         </w:rPr>
       </w:pPr>
-      <w:hyperlink w:anchor="_Toc230678435" w:history="1">
+      <w:hyperlink w:anchor="_Toc230679001" w:history="1">
         <w:r>
           <w:rPr>
             <w:rStyle w:val="Hyperkobling"/>
@@ -2904,7 +2896,7 @@
             <w:noProof/>
             <w:webHidden/>
           </w:rPr>
-          <w:instrText xml:space="preserve"> PAGEREF _Toc230678435 \h </w:instrText>
+          <w:instrText xml:space="preserve"> PAGEREF _Toc230679001 \h </w:instrText>
         </w:r>
         <w:r>
           <w:rPr>
@@ -2949,7 +2941,7 @@
           <w14:ligatures w14:val="standardContextual"/>
         </w:rPr>
       </w:pPr>
-      <w:hyperlink w:anchor="_Toc230678436" w:history="1">
+      <w:hyperlink w:anchor="_Toc230679002" w:history="1">
         <w:r>
           <w:rPr>
             <w:rStyle w:val="Hyperkobling"/>
@@ -2976,7 +2968,7 @@
             <w:noProof/>
             <w:webHidden/>
           </w:rPr>
-          <w:instrText xml:space="preserve"> PAGEREF _Toc230678436 \h </w:instrText>
+          <w:instrText xml:space="preserve"> PAGEREF _Toc230679002 \h </w:instrText>
         </w:r>
         <w:r>
           <w:rPr>
@@ -3021,7 +3013,7 @@
           <w14:ligatures w14:val="standardContextual"/>
         </w:rPr>
       </w:pPr>
-      <w:hyperlink w:anchor="_Toc230678437" w:history="1">
+      <w:hyperlink w:anchor="_Toc230679003" w:history="1">
         <w:r>
           <w:rPr>
             <w:rStyle w:val="Hyperkobling"/>
@@ -3048,7 +3040,7 @@
             <w:noProof/>
             <w:webHidden/>
           </w:rPr>
-          <w:instrText xml:space="preserve"> PAGEREF _Toc230678437 \h </w:instrText>
+          <w:instrText xml:space="preserve"> PAGEREF _Toc230679003 \h </w:instrText>
         </w:r>
         <w:r>
           <w:rPr>
@@ -3093,7 +3085,7 @@
           <w14:ligatures w14:val="standardContextual"/>
         </w:rPr>
       </w:pPr>
-      <w:hyperlink w:anchor="_Toc230678438" w:history="1">
+      <w:hyperlink w:anchor="_Toc230679004" w:history="1">
         <w:r>
           <w:rPr>
             <w:rStyle w:val="Hyperkobling"/>
@@ -3120,7 +3112,7 @@
             <w:noProof/>
             <w:webHidden/>
           </w:rPr>
-          <w:instrText xml:space="preserve"> PAGEREF _Toc230678438 \h </w:instrText>
+          <w:instrText xml:space="preserve"> PAGEREF _Toc230679004 \h </w:instrText>
         </w:r>
         <w:r>
           <w:rPr>
@@ -3165,7 +3157,7 @@
           <w14:ligatures w14:val="standardContextual"/>
         </w:rPr>
       </w:pPr>
-      <w:hyperlink w:anchor="_Toc230678439" w:history="1">
+      <w:hyperlink w:anchor="_Toc230679005" w:history="1">
         <w:r>
           <w:rPr>
             <w:rStyle w:val="Hyperkobling"/>
@@ -3192,7 +3184,7 @@
             <w:noProof/>
             <w:webHidden/>
           </w:rPr>
-          <w:instrText xml:space="preserve"> PAGEREF _Toc230678439 \h </w:instrText>
+          <w:instrText xml:space="preserve"> PAGEREF _Toc230679005 \h </w:instrText>
         </w:r>
         <w:r>
           <w:rPr>
@@ -3237,7 +3229,7 @@
           <w14:ligatures w14:val="standardContextual"/>
         </w:rPr>
       </w:pPr>
-      <w:hyperlink w:anchor="_Toc230678440" w:history="1">
+      <w:hyperlink w:anchor="_Toc230679006" w:history="1">
         <w:r>
           <w:rPr>
             <w:rStyle w:val="Hyperkobling"/>
@@ -3264,7 +3256,7 @@
             <w:noProof/>
             <w:webHidden/>
           </w:rPr>
-          <w:instrText xml:space="preserve"> PAGEREF _Toc230678440 \h </w:instrText>
+          <w:instrText xml:space="preserve"> PAGEREF _Toc230679006 \h </w:instrText>
         </w:r>
         <w:r>
           <w:rPr>
@@ -3309,7 +3301,7 @@
           <w14:ligatures w14:val="standardContextual"/>
         </w:rPr>
       </w:pPr>
-      <w:hyperlink w:anchor="_Toc230678441" w:history="1">
+      <w:hyperlink w:anchor="_Toc230679007" w:history="1">
         <w:r>
           <w:rPr>
             <w:rStyle w:val="Hyperkobling"/>
@@ -3336,7 +3328,7 @@
             <w:noProof/>
             <w:webHidden/>
           </w:rPr>
-          <w:instrText xml:space="preserve"> PAGEREF _Toc230678441 \h </w:instrText>
+          <w:instrText xml:space="preserve"> PAGEREF _Toc230679007 \h </w:instrText>
         </w:r>
         <w:r>
           <w:rPr>
@@ -3381,7 +3373,7 @@
           <w14:ligatures w14:val="standardContextual"/>
         </w:rPr>
       </w:pPr>
-      <w:hyperlink w:anchor="_Toc230678442" w:history="1">
+      <w:hyperlink w:anchor="_Toc230679008" w:history="1">
         <w:r>
           <w:rPr>
             <w:rStyle w:val="Hyperkobling"/>
@@ -3408,7 +3400,7 @@
             <w:noProof/>
             <w:webHidden/>
           </w:rPr>
-          <w:instrText xml:space="preserve"> PAGEREF _Toc230678442 \h </w:instrText>
+          <w:instrText xml:space="preserve"> PAGEREF _Toc230679008 \h </w:instrText>
         </w:r>
         <w:r>
           <w:rPr>
@@ -3453,7 +3445,7 @@
           <w14:ligatures w14:val="standardContextual"/>
         </w:rPr>
       </w:pPr>
-      <w:hyperlink w:anchor="_Toc230678443" w:history="1">
+      <w:hyperlink w:anchor="_Toc230679009" w:history="1">
         <w:r>
           <w:rPr>
             <w:rStyle w:val="Hyperkobling"/>
@@ -3480,7 +3472,7 @@
             <w:noProof/>
             <w:webHidden/>
           </w:rPr>
-          <w:instrText xml:space="preserve"> PAGEREF _Toc230678443 \h </w:instrText>
+          <w:instrText xml:space="preserve"> PAGEREF _Toc230679009 \h </w:instrText>
         </w:r>
         <w:r>
           <w:rPr>
@@ -3525,7 +3517,7 @@
           <w14:ligatures w14:val="standardContextual"/>
         </w:rPr>
       </w:pPr>
-      <w:hyperlink w:anchor="_Toc230678444" w:history="1">
+      <w:hyperlink w:anchor="_Toc230679010" w:history="1">
         <w:r>
           <w:rPr>
             <w:rStyle w:val="Hyperkobling"/>
@@ -3552,7 +3544,7 @@
             <w:noProof/>
             <w:webHidden/>
           </w:rPr>
-          <w:instrText xml:space="preserve"> PAGEREF _Toc230678444 \h </w:instrText>
+          <w:instrText xml:space="preserve"> PAGEREF _Toc230679010 \h </w:instrText>
         </w:r>
         <w:r>
           <w:rPr>
@@ -3597,7 +3589,7 @@
           <w14:ligatures w14:val="standardContextual"/>
         </w:rPr>
       </w:pPr>
-      <w:hyperlink w:anchor="_Toc230678445" w:history="1">
+      <w:hyperlink w:anchor="_Toc230679011" w:history="1">
         <w:r>
           <w:rPr>
             <w:rStyle w:val="Hyperkobling"/>
@@ -3624,7 +3616,7 @@
             <w:noProof/>
             <w:webHidden/>
           </w:rPr>
-          <w:instrText xml:space="preserve"> PAGEREF _Toc230678445 \h </w:instrText>
+          <w:instrText xml:space="preserve"> PAGEREF _Toc230679011 \h </w:instrText>
         </w:r>
         <w:r>
           <w:rPr>
@@ -3669,7 +3661,7 @@
           <w14:ligatures w14:val="standardContextual"/>
         </w:rPr>
       </w:pPr>
-      <w:hyperlink w:anchor="_Toc230678446" w:history="1">
+      <w:hyperlink w:anchor="_Toc230679012" w:history="1">
         <w:r>
           <w:rPr>
             <w:rStyle w:val="Hyperkobling"/>
@@ -3696,7 +3688,7 @@
             <w:noProof/>
             <w:webHidden/>
           </w:rPr>
-          <w:instrText xml:space="preserve"> PAGEREF _Toc230678446 \h </w:instrText>
+          <w:instrText xml:space="preserve"> PAGEREF _Toc230679012 \h </w:instrText>
         </w:r>
         <w:r>
           <w:rPr>
@@ -3741,7 +3733,7 @@
           <w14:ligatures w14:val="standardContextual"/>
         </w:rPr>
       </w:pPr>
-      <w:hyperlink w:anchor="_Toc230678447" w:history="1">
+      <w:hyperlink w:anchor="_Toc230679013" w:history="1">
         <w:r>
           <w:rPr>
             <w:rStyle w:val="Hyperkobling"/>
@@ -3768,7 +3760,7 @@
             <w:noProof/>
             <w:webHidden/>
           </w:rPr>
-          <w:instrText xml:space="preserve"> PAGEREF _Toc230678447 \h </w:instrText>
+          <w:instrText xml:space="preserve"> PAGEREF _Toc230679013 \h </w:instrText>
         </w:r>
         <w:r>
           <w:rPr>
@@ -3813,7 +3805,7 @@
           <w14:ligatures w14:val="standardContextual"/>
         </w:rPr>
       </w:pPr>
-      <w:hyperlink w:anchor="_Toc230678448" w:history="1">
+      <w:hyperlink w:anchor="_Toc230679014" w:history="1">
         <w:r>
           <w:rPr>
             <w:rStyle w:val="Hyperkobling"/>
@@ -3840,7 +3832,7 @@
             <w:noProof/>
             <w:webHidden/>
           </w:rPr>
-          <w:instrText xml:space="preserve"> PAGEREF _Toc230678448 \h </w:instrText>
+          <w:instrText xml:space="preserve"> PAGEREF _Toc230679014 \h </w:instrText>
         </w:r>
         <w:r>
           <w:rPr>
@@ -3885,7 +3877,7 @@
           <w14:ligatures w14:val="standardContextual"/>
         </w:rPr>
       </w:pPr>
-      <w:hyperlink w:anchor="_Toc230678449" w:history="1">
+      <w:hyperlink w:anchor="_Toc230679015" w:history="1">
         <w:r>
           <w:rPr>
             <w:rStyle w:val="Hyperkobling"/>
@@ -3912,7 +3904,7 @@
             <w:noProof/>
             <w:webHidden/>
           </w:rPr>
-          <w:instrText xml:space="preserve"> PAGEREF _Toc230678449 \h </w:instrText>
+          <w:instrText xml:space="preserve"> PAGEREF _Toc230679015 \h </w:instrText>
         </w:r>
         <w:r>
           <w:rPr>
@@ -3957,7 +3949,7 @@
           <w14:ligatures w14:val="standardContextual"/>
         </w:rPr>
       </w:pPr>
-      <w:hyperlink w:anchor="_Toc230678450" w:history="1">
+      <w:hyperlink w:anchor="_Toc230679016" w:history="1">
         <w:r>
           <w:rPr>
             <w:rStyle w:val="Hyperkobling"/>
@@ -3984,7 +3976,7 @@
             <w:noProof/>
             <w:webHidden/>
           </w:rPr>
-          <w:instrText xml:space="preserve"> PAGEREF _Toc230678450 \h </w:instrText>
+          <w:instrText xml:space="preserve"> PAGEREF _Toc230679016 \h </w:instrText>
         </w:r>
         <w:r>
           <w:rPr>
@@ -4029,7 +4021,7 @@
           <w14:ligatures w14:val="standardContextual"/>
         </w:rPr>
       </w:pPr>
-      <w:hyperlink w:anchor="_Toc230678451" w:history="1">
+      <w:hyperlink w:anchor="_Toc230679017" w:history="1">
         <w:r>
           <w:rPr>
             <w:rStyle w:val="Hyperkobling"/>
@@ -4056,7 +4048,7 @@
             <w:noProof/>
             <w:webHidden/>
           </w:rPr>
-          <w:instrText xml:space="preserve"> PAGEREF _Toc230678451 \h </w:instrText>
+          <w:instrText xml:space="preserve"> PAGEREF _Toc230679017 \h </w:instrText>
         </w:r>
         <w:r>
           <w:rPr>
@@ -4101,7 +4093,7 @@
           <w14:ligatures w14:val="standardContextual"/>
         </w:rPr>
       </w:pPr>
-      <w:hyperlink w:anchor="_Toc230678452" w:history="1">
+      <w:hyperlink w:anchor="_Toc230679018" w:history="1">
         <w:r>
           <w:rPr>
             <w:rStyle w:val="Hyperkobling"/>
@@ -4128,7 +4120,7 @@
             <w:noProof/>
             <w:webHidden/>
           </w:rPr>
-          <w:instrText xml:space="preserve"> PAGEREF _Toc230678452 \h </w:instrText>
+          <w:instrText xml:space="preserve"> PAGEREF _Toc230679018 \h </w:instrText>
         </w:r>
         <w:r>
           <w:rPr>
@@ -4173,7 +4165,7 @@
           <w14:ligatures w14:val="standardContextual"/>
         </w:rPr>
       </w:pPr>
-      <w:hyperlink w:anchor="_Toc230678453" w:history="1">
+      <w:hyperlink w:anchor="_Toc230679019" w:history="1">
         <w:r>
           <w:rPr>
             <w:rStyle w:val="Hyperkobling"/>
@@ -4200,7 +4192,7 @@
             <w:noProof/>
             <w:webHidden/>
           </w:rPr>
-          <w:instrText xml:space="preserve"> PAGEREF _Toc230678453 \h </w:instrText>
+          <w:instrText xml:space="preserve"> PAGEREF _Toc230679019 \h </w:instrText>
         </w:r>
         <w:r>
           <w:rPr>
@@ -4245,7 +4237,7 @@
           <w14:ligatures w14:val="standardContextual"/>
         </w:rPr>
       </w:pPr>
-      <w:hyperlink w:anchor="_Toc230678454" w:history="1">
+      <w:hyperlink w:anchor="_Toc230679020" w:history="1">
         <w:r>
           <w:rPr>
             <w:rStyle w:val="Hyperkobling"/>
@@ -4272,7 +4264,7 @@
             <w:noProof/>
             <w:webHidden/>
           </w:rPr>
-          <w:instrText xml:space="preserve"> PAGEREF _Toc230678454 \h </w:instrText>
+          <w:instrText xml:space="preserve"> PAGEREF _Toc230679020 \h </w:instrText>
         </w:r>
         <w:r>
           <w:rPr>
@@ -4317,7 +4309,7 @@
           <w14:ligatures w14:val="standardContextual"/>
         </w:rPr>
       </w:pPr>
-      <w:hyperlink w:anchor="_Toc230678455" w:history="1">
+      <w:hyperlink w:anchor="_Toc230679021" w:history="1">
         <w:r>
           <w:rPr>
             <w:rStyle w:val="Hyperkobling"/>
@@ -4344,7 +4336,7 @@
             <w:noProof/>
             <w:webHidden/>
           </w:rPr>
-          <w:instrText xml:space="preserve"> PAGEREF _Toc230678455 \h </w:instrText>
+          <w:instrText xml:space="preserve"> PAGEREF _Toc230679021 \h </w:instrText>
         </w:r>
         <w:r>
           <w:rPr>
@@ -4389,7 +4381,7 @@
           <w14:ligatures w14:val="standardContextual"/>
         </w:rPr>
       </w:pPr>
-      <w:hyperlink w:anchor="_Toc230678456" w:history="1">
+      <w:hyperlink w:anchor="_Toc230679022" w:history="1">
         <w:r>
           <w:rPr>
             <w:rStyle w:val="Hyperkobling"/>
@@ -4416,7 +4408,7 @@
             <w:noProof/>
             <w:webHidden/>
           </w:rPr>
-          <w:instrText xml:space="preserve"> PAGEREF _Toc230678456 \h </w:instrText>
+          <w:instrText xml:space="preserve"> PAGEREF _Toc230679022 \h </w:instrText>
         </w:r>
         <w:r>
           <w:rPr>
@@ -4461,7 +4453,7 @@
           <w14:ligatures w14:val="standardContextual"/>
         </w:rPr>
       </w:pPr>
-      <w:hyperlink w:anchor="_Toc230678457" w:history="1">
+      <w:hyperlink w:anchor="_Toc230679023" w:history="1">
         <w:r>
           <w:rPr>
             <w:rStyle w:val="Hyperkobling"/>
@@ -4488,7 +4480,7 @@
             <w:noProof/>
             <w:webHidden/>
           </w:rPr>
-          <w:instrText xml:space="preserve"> PAGEREF _Toc230678457 \h </w:instrText>
+          <w:instrText xml:space="preserve"> PAGEREF _Toc230679023 \h </w:instrText>
         </w:r>
         <w:r>
           <w:rPr>
@@ -4533,7 +4525,7 @@
           <w14:ligatures w14:val="standardContextual"/>
         </w:rPr>
       </w:pPr>
-      <w:hyperlink w:anchor="_Toc230678458" w:history="1">
+      <w:hyperlink w:anchor="_Toc230679024" w:history="1">
         <w:r>
           <w:rPr>
             <w:rStyle w:val="Hyperkobling"/>
@@ -4560,7 +4552,7 @@
             <w:noProof/>
             <w:webHidden/>
           </w:rPr>
-          <w:instrText xml:space="preserve"> PAGEREF _Toc230678458 \h </w:instrText>
+          <w:instrText xml:space="preserve"> PAGEREF _Toc230679024 \h </w:instrText>
         </w:r>
         <w:r>
           <w:rPr>
@@ -4605,7 +4597,7 @@
           <w14:ligatures w14:val="standardContextual"/>
         </w:rPr>
       </w:pPr>
-      <w:hyperlink w:anchor="_Toc230678459" w:history="1">
+      <w:hyperlink w:anchor="_Toc230679025" w:history="1">
         <w:r>
           <w:rPr>
             <w:rStyle w:val="Hyperkobling"/>
@@ -4632,7 +4624,7 @@
             <w:noProof/>
             <w:webHidden/>
           </w:rPr>
-          <w:instrText xml:space="preserve"> PAGEREF _Toc230678459 \h </w:instrText>
+          <w:instrText xml:space="preserve"> PAGEREF _Toc230679025 \h </w:instrText>
         </w:r>
         <w:r>
           <w:rPr>
@@ -4677,7 +4669,7 @@
           <w14:ligatures w14:val="standardContextual"/>
         </w:rPr>
       </w:pPr>
-      <w:hyperlink w:anchor="_Toc230678460" w:history="1">
+      <w:hyperlink w:anchor="_Toc230679026" w:history="1">
         <w:r>
           <w:rPr>
             <w:rStyle w:val="Hyperkobling"/>
@@ -4704,7 +4696,7 @@
             <w:noProof/>
             <w:webHidden/>
           </w:rPr>
-          <w:instrText xml:space="preserve"> PAGEREF _Toc230678460 \h </w:instrText>
+          <w:instrText xml:space="preserve"> PAGEREF _Toc230679026 \h </w:instrText>
         </w:r>
         <w:r>
           <w:rPr>
@@ -4749,7 +4741,7 @@
           <w14:ligatures w14:val="standardContextual"/>
         </w:rPr>
       </w:pPr>
-      <w:hyperlink w:anchor="_Toc230678461" w:history="1">
+      <w:hyperlink w:anchor="_Toc230679027" w:history="1">
         <w:r>
           <w:rPr>
             <w:rStyle w:val="Hyperkobling"/>
@@ -4776,7 +4768,7 @@
             <w:noProof/>
             <w:webHidden/>
           </w:rPr>
-          <w:instrText xml:space="preserve"> PAGEREF _Toc230678461 \h </w:instrText>
+          <w:instrText xml:space="preserve"> PAGEREF _Toc230679027 \h </w:instrText>
         </w:r>
         <w:r>
           <w:rPr>
@@ -4821,7 +4813,7 @@
           <w14:ligatures w14:val="standardContextual"/>
         </w:rPr>
       </w:pPr>
-      <w:hyperlink w:anchor="_Toc230678462" w:history="1">
+      <w:hyperlink w:anchor="_Toc230679028" w:history="1">
         <w:r>
           <w:rPr>
             <w:rStyle w:val="Hyperkobling"/>
@@ -4848,7 +4840,7 @@
             <w:noProof/>
             <w:webHidden/>
           </w:rPr>
-          <w:instrText xml:space="preserve"> PAGEREF _Toc230678462 \h </w:instrText>
+          <w:instrText xml:space="preserve"> PAGEREF _Toc230679028 \h </w:instrText>
         </w:r>
         <w:r>
           <w:rPr>
@@ -4893,7 +4885,7 @@
           <w14:ligatures w14:val="standardContextual"/>
         </w:rPr>
       </w:pPr>
-      <w:hyperlink w:anchor="_Toc230678463" w:history="1">
+      <w:hyperlink w:anchor="_Toc230679029" w:history="1">
         <w:r>
           <w:rPr>
             <w:rStyle w:val="Hyperkobling"/>
@@ -4920,7 +4912,7 @@
             <w:noProof/>
             <w:webHidden/>
           </w:rPr>
-          <w:instrText xml:space="preserve"> PAGEREF _Toc230678463 \h </w:instrText>
+          <w:instrText xml:space="preserve"> PAGEREF _Toc230679029 \h </w:instrText>
         </w:r>
         <w:r>
           <w:rPr>
@@ -4965,7 +4957,7 @@
           <w14:ligatures w14:val="standardContextual"/>
         </w:rPr>
       </w:pPr>
-      <w:hyperlink w:anchor="_Toc230678464" w:history="1">
+      <w:hyperlink w:anchor="_Toc230679030" w:history="1">
         <w:r>
           <w:rPr>
             <w:rStyle w:val="Hyperkobling"/>
@@ -4992,7 +4984,7 @@
             <w:noProof/>
             <w:webHidden/>
           </w:rPr>
-          <w:instrText xml:space="preserve"> PAGEREF _Toc230678464 \h </w:instrText>
+          <w:instrText xml:space="preserve"> PAGEREF _Toc230679030 \h </w:instrText>
         </w:r>
         <w:r>
           <w:rPr>
@@ -5037,7 +5029,7 @@
           <w14:ligatures w14:val="standardContextual"/>
         </w:rPr>
       </w:pPr>
-      <w:hyperlink w:anchor="_Toc230678465" w:history="1">
+      <w:hyperlink w:anchor="_Toc230679031" w:history="1">
         <w:r>
           <w:rPr>
             <w:rStyle w:val="Hyperkobling"/>
@@ -5064,7 +5056,7 @@
             <w:noProof/>
             <w:webHidden/>
           </w:rPr>
-          <w:instrText xml:space="preserve"> PAGEREF _Toc230678465 \h </w:instrText>
+          <w:instrText xml:space="preserve"> PAGEREF _Toc230679031 \h </w:instrText>
         </w:r>
         <w:r>
           <w:rPr>
@@ -5109,7 +5101,7 @@
           <w14:ligatures w14:val="standardContextual"/>
         </w:rPr>
       </w:pPr>
-      <w:hyperlink w:anchor="_Toc230678466" w:history="1">
+      <w:hyperlink w:anchor="_Toc230679032" w:history="1">
         <w:r>
           <w:rPr>
             <w:rStyle w:val="Hyperkobling"/>
@@ -5136,7 +5128,7 @@
             <w:noProof/>
             <w:webHidden/>
           </w:rPr>
-          <w:instrText xml:space="preserve"> PAGEREF _Toc230678466 \h </w:instrText>
+          <w:instrText xml:space="preserve"> PAGEREF _Toc230679032 \h </w:instrText>
         </w:r>
         <w:r>
           <w:rPr>
@@ -5181,7 +5173,7 @@
           <w14:ligatures w14:val="standardContextual"/>
         </w:rPr>
       </w:pPr>
-      <w:hyperlink w:anchor="_Toc230678467" w:history="1">
+      <w:hyperlink w:anchor="_Toc230679033" w:history="1">
         <w:r>
           <w:rPr>
             <w:rStyle w:val="Hyperkobling"/>
@@ -5208,7 +5200,7 @@
             <w:noProof/>
             <w:webHidden/>
           </w:rPr>
-          <w:instrText xml:space="preserve"> PAGEREF _Toc230678467 \h </w:instrText>
+          <w:instrText xml:space="preserve"> PAGEREF _Toc230679033 \h </w:instrText>
         </w:r>
         <w:r>
           <w:rPr>
@@ -5253,7 +5245,7 @@
           <w14:ligatures w14:val="standardContextual"/>
         </w:rPr>
       </w:pPr>
-      <w:hyperlink w:anchor="_Toc230678468" w:history="1">
+      <w:hyperlink w:anchor="_Toc230679034" w:history="1">
         <w:r>
           <w:rPr>
             <w:rStyle w:val="Hyperkobling"/>
@@ -5280,7 +5272,7 @@
             <w:noProof/>
             <w:webHidden/>
           </w:rPr>
-          <w:instrText xml:space="preserve"> PAGEREF _Toc230678468 \h </w:instrText>
+          <w:instrText xml:space="preserve"> PAGEREF _Toc230679034 \h </w:instrText>
         </w:r>
         <w:r>
           <w:rPr>
@@ -5325,7 +5317,7 @@
           <w14:ligatures w14:val="standardContextual"/>
         </w:rPr>
       </w:pPr>
-      <w:hyperlink w:anchor="_Toc230678469" w:history="1">
+      <w:hyperlink w:anchor="_Toc230679035" w:history="1">
         <w:r>
           <w:rPr>
             <w:rStyle w:val="Hyperkobling"/>
@@ -5352,7 +5344,7 @@
             <w:noProof/>
             <w:webHidden/>
           </w:rPr>
-          <w:instrText xml:space="preserve"> PAGEREF _Toc230678469 \h </w:instrText>
+          <w:instrText xml:space="preserve"> PAGEREF _Toc230679035 \h </w:instrText>
         </w:r>
         <w:r>
           <w:rPr>
@@ -5397,7 +5389,7 @@
           <w14:ligatures w14:val="standardContextual"/>
         </w:rPr>
       </w:pPr>
-      <w:hyperlink w:anchor="_Toc230678470" w:history="1">
+      <w:hyperlink w:anchor="_Toc230679036" w:history="1">
         <w:r>
           <w:rPr>
             <w:rStyle w:val="Hyperkobling"/>
@@ -5424,7 +5416,7 @@
             <w:noProof/>
             <w:webHidden/>
           </w:rPr>
-          <w:instrText xml:space="preserve"> PAGEREF _Toc230678470 \h </w:instrText>
+          <w:instrText xml:space="preserve"> PAGEREF _Toc230679036 \h </w:instrText>
         </w:r>
         <w:r>
           <w:rPr>
@@ -5469,7 +5461,7 @@
           <w14:ligatures w14:val="standardContextual"/>
         </w:rPr>
       </w:pPr>
-      <w:hyperlink w:anchor="_Toc230678471" w:history="1">
+      <w:hyperlink w:anchor="_Toc230679037" w:history="1">
         <w:r>
           <w:rPr>
             <w:rStyle w:val="Hyperkobling"/>
@@ -5496,7 +5488,7 @@
             <w:noProof/>
             <w:webHidden/>
           </w:rPr>
-          <w:instrText xml:space="preserve"> PAGEREF _Toc230678471 \h </w:instrText>
+          <w:instrText xml:space="preserve"> PAGEREF _Toc230679037 \h </w:instrText>
         </w:r>
         <w:r>
           <w:rPr>
@@ -5541,7 +5533,7 @@
           <w14:ligatures w14:val="standardContextual"/>
         </w:rPr>
       </w:pPr>
-      <w:hyperlink w:anchor="_Toc230678472" w:history="1">
+      <w:hyperlink w:anchor="_Toc230679038" w:history="1">
         <w:r>
           <w:rPr>
             <w:rStyle w:val="Hyperkobling"/>
@@ -5576,7 +5568,7 @@
             <w:noProof/>
             <w:webHidden/>
           </w:rPr>
-          <w:instrText xml:space="preserve"> PAGEREF _Toc230678472 \h </w:instrText>
+          <w:instrText xml:space="preserve"> PAGEREF _Toc230679038 \h </w:instrText>
         </w:r>
         <w:r>
           <w:rPr>
@@ -5634,7 +5626,7 @@
         <w:pStyle w:val="Overskrift2"/>
       </w:pPr>
       <w:bookmarkStart w:id="11" w:name="innledning"/>
-      <w:bookmarkStart w:id="12" w:name="_Toc230678415"/>
+      <w:bookmarkStart w:id="12" w:name="_Toc230678981"/>
       <w:bookmarkEnd w:id="9"/>
       <w:r>
         <w:t>1. Innledning</w:t>
@@ -5726,7 +5718,7 @@
         <w:pStyle w:val="Overskrift3"/>
       </w:pPr>
       <w:bookmarkStart w:id="13" w:name="problemstilling"/>
-      <w:bookmarkStart w:id="14" w:name="_Toc230678416"/>
+      <w:bookmarkStart w:id="14" w:name="_Toc230678982"/>
       <w:r>
         <w:t>1.1 Problemstilling</w:t>
       </w:r>
@@ -5785,7 +5777,7 @@
         <w:pStyle w:val="Overskrift3"/>
       </w:pPr>
       <w:bookmarkStart w:id="15" w:name="delproblemer"/>
-      <w:bookmarkStart w:id="16" w:name="_Toc230678417"/>
+      <w:bookmarkStart w:id="16" w:name="_Toc230678983"/>
       <w:bookmarkEnd w:id="13"/>
       <w:r>
         <w:t>1.2 Delproblemer</w:t>
@@ -5985,7 +5977,7 @@
         <w:pStyle w:val="Overskrift3"/>
       </w:pPr>
       <w:bookmarkStart w:id="17" w:name="avgrensninger"/>
-      <w:bookmarkStart w:id="18" w:name="_Toc230678418"/>
+      <w:bookmarkStart w:id="18" w:name="_Toc230678984"/>
       <w:bookmarkEnd w:id="15"/>
       <w:r>
         <w:t>1.3 Avgrensninger</w:t>
@@ -6242,7 +6234,7 @@
         <w:pStyle w:val="Overskrift3"/>
       </w:pPr>
       <w:bookmarkStart w:id="19" w:name="antakelser"/>
-      <w:bookmarkStart w:id="20" w:name="_Toc230678419"/>
+      <w:bookmarkStart w:id="20" w:name="_Toc230678985"/>
       <w:bookmarkEnd w:id="17"/>
       <w:r>
         <w:t>1.4 Antakelser</w:t>
@@ -6419,7 +6411,7 @@
         <w:pStyle w:val="Overskrift3"/>
       </w:pPr>
       <w:bookmarkStart w:id="21" w:name="anvendte-bidrag-i-case-studien"/>
-      <w:bookmarkStart w:id="22" w:name="_Toc230678420"/>
+      <w:bookmarkStart w:id="22" w:name="_Toc230678986"/>
       <w:bookmarkEnd w:id="19"/>
       <w:r>
         <w:t>1.5 Anvendte bidrag i case-studien</w:t>
@@ -6611,7 +6603,7 @@
         <w:rPr>
           <w:rFonts w:eastAsia="Times New Roman" w:cs="Times New Roman"/>
         </w:rPr>
-        <w:pict w14:anchorId="270E7D3A">
+        <w:pict w14:anchorId="01D6ACCD">
           <v:rect id="_x0000_i1028" style="width:0;height:1.5pt" o:hralign="center" o:hrstd="t" o:hr="t"/>
         </w:pict>
       </w:r>
@@ -6621,7 +6613,7 @@
         <w:pStyle w:val="Overskrift2"/>
       </w:pPr>
       <w:bookmarkStart w:id="23" w:name="litteratur"/>
-      <w:bookmarkStart w:id="24" w:name="_Toc230678421"/>
+      <w:bookmarkStart w:id="24" w:name="_Toc230678987"/>
       <w:bookmarkEnd w:id="11"/>
       <w:bookmarkEnd w:id="21"/>
       <w:r>
@@ -6646,7 +6638,7 @@
         <w:pStyle w:val="Overskrift3"/>
       </w:pPr>
       <w:bookmarkStart w:id="25" w:name="X7c64d5c69e8be4aa342d1f5b50a96f4760fe6ea"/>
-      <w:bookmarkStart w:id="26" w:name="_Toc230678422"/>
+      <w:bookmarkStart w:id="26" w:name="_Toc230678988"/>
       <w:r>
         <w:t>2.1 Maskinlæring for kostnadsprediksjon i transport og logistikk</w:t>
       </w:r>
@@ -6713,7 +6705,7 @@
         <w:pStyle w:val="Overskrift3"/>
       </w:pPr>
       <w:bookmarkStart w:id="27" w:name="X50f1a326dd81dd1da535bd6543ea8d29f23ade9"/>
-      <w:bookmarkStart w:id="28" w:name="_Toc230678423"/>
+      <w:bookmarkStart w:id="28" w:name="_Toc230678989"/>
       <w:bookmarkEnd w:id="25"/>
       <w:r>
         <w:t>2.2 Gradient boosting på heterogene tabulære data</w:t>
@@ -6848,7 +6840,7 @@
         <w:pStyle w:val="Overskrift3"/>
       </w:pPr>
       <w:bookmarkStart w:id="29" w:name="X52ccaa96010e029cb7ad8233c60e45490ae75db"/>
-      <w:bookmarkStart w:id="30" w:name="_Toc230678424"/>
+      <w:bookmarkStart w:id="30" w:name="_Toc230678990"/>
       <w:bookmarkEnd w:id="27"/>
       <w:r>
         <w:t>2.3 Konform prediksjon og usikkerhetskvantifisering</w:t>
@@ -6917,7 +6909,7 @@
         <w:pStyle w:val="Overskrift3"/>
       </w:pPr>
       <w:bookmarkStart w:id="31" w:name="forskningsgap"/>
-      <w:bookmarkStart w:id="32" w:name="_Toc230678425"/>
+      <w:bookmarkStart w:id="32" w:name="_Toc230678991"/>
       <w:bookmarkEnd w:id="29"/>
       <w:r>
         <w:t>2.4 Forskningsgap</w:t>
@@ -7029,7 +7021,7 @@
         <w:rPr>
           <w:rFonts w:eastAsia="Times New Roman" w:cs="Times New Roman"/>
         </w:rPr>
-        <w:pict w14:anchorId="71E6D9E8">
+        <w:pict w14:anchorId="23AFF86F">
           <v:rect id="_x0000_i1029" style="width:0;height:1.5pt" o:hralign="center" o:hrstd="t" o:hr="t"/>
         </w:pict>
       </w:r>
@@ -7039,7 +7031,7 @@
         <w:pStyle w:val="Overskrift2"/>
       </w:pPr>
       <w:bookmarkStart w:id="33" w:name="teori"/>
-      <w:bookmarkStart w:id="34" w:name="_Toc230678426"/>
+      <w:bookmarkStart w:id="34" w:name="_Toc230678992"/>
       <w:bookmarkEnd w:id="23"/>
       <w:bookmarkEnd w:id="31"/>
       <w:r>
@@ -7071,7 +7063,7 @@
         <w:pStyle w:val="Overskrift3"/>
       </w:pPr>
       <w:bookmarkStart w:id="35" w:name="tabulær-læring-og-gradient-boosting"/>
-      <w:bookmarkStart w:id="36" w:name="_Toc230678427"/>
+      <w:bookmarkStart w:id="36" w:name="_Toc230678993"/>
       <w:r>
         <w:t>3.1 Tabulær læring og gradient boosting</w:t>
       </w:r>
@@ -8184,7 +8176,7 @@
         <w:pStyle w:val="Overskrift3"/>
       </w:pPr>
       <w:bookmarkStart w:id="37" w:name="lightgbm"/>
-      <w:bookmarkStart w:id="38" w:name="_Toc230678428"/>
+      <w:bookmarkStart w:id="38" w:name="_Toc230678994"/>
       <w:bookmarkEnd w:id="35"/>
       <w:r>
         <w:t>3.2 LightGBM</w:t>
@@ -8694,7 +8686,7 @@
         <w:pStyle w:val="Overskrift3"/>
       </w:pPr>
       <w:bookmarkStart w:id="39" w:name="catboost"/>
-      <w:bookmarkStart w:id="40" w:name="_Toc230678429"/>
+      <w:bookmarkStart w:id="40" w:name="_Toc230678995"/>
       <w:bookmarkEnd w:id="37"/>
       <w:r>
         <w:t>3.3 CatBoost</w:t>
@@ -9408,7 +9400,7 @@
         <w:pStyle w:val="Overskrift3"/>
       </w:pPr>
       <w:bookmarkStart w:id="41" w:name="log-transformert-mål-og-evaluering"/>
-      <w:bookmarkStart w:id="42" w:name="_Toc230678430"/>
+      <w:bookmarkStart w:id="42" w:name="_Toc230678996"/>
       <w:bookmarkEnd w:id="39"/>
       <w:r>
         <w:t>3.4 Log-transformert mål og evaluering</w:t>
@@ -10772,7 +10764,7 @@
         <w:pStyle w:val="Overskrift3"/>
       </w:pPr>
       <w:bookmarkStart w:id="43" w:name="kvantilregresjon-og-konform-prediksjon"/>
-      <w:bookmarkStart w:id="44" w:name="_Toc230678431"/>
+      <w:bookmarkStart w:id="44" w:name="_Toc230678997"/>
       <w:bookmarkEnd w:id="41"/>
       <w:r>
         <w:t>3.5 Kvantil</w:t>
@@ -12943,7 +12935,7 @@
         <w:pStyle w:val="Overskrift3"/>
       </w:pPr>
       <w:bookmarkStart w:id="45" w:name="shap-verdier"/>
-      <w:bookmarkStart w:id="46" w:name="_Toc230678432"/>
+      <w:bookmarkStart w:id="46" w:name="_Toc230678998"/>
       <w:bookmarkEnd w:id="43"/>
       <w:r>
         <w:t>3.6 SHAP-verdier</w:t>
@@ -13968,7 +13960,7 @@
         <w:rPr>
           <w:rFonts w:eastAsia="Times New Roman" w:cs="Times New Roman"/>
         </w:rPr>
-        <w:pict w14:anchorId="40429031">
+        <w:pict w14:anchorId="30DA8A80">
           <v:rect id="_x0000_i1030" style="width:0;height:1.5pt" o:hralign="center" o:hrstd="t" o:hr="t"/>
         </w:pict>
       </w:r>
@@ -13978,7 +13970,7 @@
         <w:pStyle w:val="Overskrift2"/>
       </w:pPr>
       <w:bookmarkStart w:id="47" w:name="casebeskrivelse"/>
-      <w:bookmarkStart w:id="48" w:name="_Toc230678433"/>
+      <w:bookmarkStart w:id="48" w:name="_Toc230678999"/>
       <w:bookmarkEnd w:id="33"/>
       <w:bookmarkEnd w:id="45"/>
       <w:r>
@@ -14549,7 +14541,7 @@
         <w:rPr>
           <w:rFonts w:eastAsia="Times New Roman" w:cs="Times New Roman"/>
         </w:rPr>
-        <w:pict w14:anchorId="54A28BD4">
+        <w:pict w14:anchorId="4B00289E">
           <v:rect id="_x0000_i1031" style="width:0;height:1.5pt" o:hralign="center" o:hrstd="t" o:hr="t"/>
         </w:pict>
       </w:r>
@@ -14559,7 +14551,7 @@
         <w:pStyle w:val="Overskrift2"/>
       </w:pPr>
       <w:bookmarkStart w:id="49" w:name="metode-og-data"/>
-      <w:bookmarkStart w:id="50" w:name="_Toc230678434"/>
+      <w:bookmarkStart w:id="50" w:name="_Toc230679000"/>
       <w:bookmarkEnd w:id="47"/>
       <w:r>
         <w:t>5. Metode og data</w:t>
@@ -14571,7 +14563,7 @@
         <w:pStyle w:val="Overskrift3"/>
       </w:pPr>
       <w:bookmarkStart w:id="51" w:name="prosessmapping-mot-pensumkompendiet"/>
-      <w:bookmarkStart w:id="52" w:name="_Toc230678435"/>
+      <w:bookmarkStart w:id="52" w:name="_Toc230679001"/>
       <w:r>
         <w:t>5.0 Prosess</w:t>
       </w:r>
@@ -14921,7 +14913,7 @@
         <w:pStyle w:val="Overskrift3"/>
       </w:pPr>
       <w:bookmarkStart w:id="53" w:name="forskningsdesign"/>
-      <w:bookmarkStart w:id="54" w:name="_Toc230678436"/>
+      <w:bookmarkStart w:id="54" w:name="_Toc230679002"/>
       <w:bookmarkEnd w:id="51"/>
       <w:r>
         <w:t>5.1 Forskningsdesign</w:t>
@@ -14966,7 +14958,7 @@
         <w:pStyle w:val="Overskrift3"/>
       </w:pPr>
       <w:bookmarkStart w:id="55" w:name="datakilder"/>
-      <w:bookmarkStart w:id="56" w:name="_Toc230678437"/>
+      <w:bookmarkStart w:id="56" w:name="_Toc230679003"/>
       <w:bookmarkEnd w:id="53"/>
       <w:r>
         <w:t>5.2 Datakilder</w:t>
@@ -15461,7 +15453,7 @@
         <w:pStyle w:val="Overskrift3"/>
       </w:pPr>
       <w:bookmarkStart w:id="57" w:name="datapreparering"/>
-      <w:bookmarkStart w:id="58" w:name="_Toc230678438"/>
+      <w:bookmarkStart w:id="58" w:name="_Toc230679004"/>
       <w:bookmarkEnd w:id="55"/>
       <w:r>
         <w:t>5.3 Datapreparering</w:t>
@@ -15730,7 +15722,7 @@
         <w:pStyle w:val="Overskrift3"/>
       </w:pPr>
       <w:bookmarkStart w:id="59" w:name="datasplit-og-evalueringsprotokoll"/>
-      <w:bookmarkStart w:id="60" w:name="_Toc230678439"/>
+      <w:bookmarkStart w:id="60" w:name="_Toc230679005"/>
       <w:bookmarkEnd w:id="57"/>
       <w:r>
         <w:t>5.4 Datasplit og evalueringsprotokoll</w:t>
@@ -16308,7 +16300,7 @@
         <w:pStyle w:val="Overskrift3"/>
       </w:pPr>
       <w:bookmarkStart w:id="61" w:name="feature-engineering"/>
-      <w:bookmarkStart w:id="62" w:name="_Toc230678440"/>
+      <w:bookmarkStart w:id="62" w:name="_Toc230679006"/>
       <w:bookmarkEnd w:id="59"/>
       <w:r>
         <w:t>5.5 Feature engineering</w:t>
@@ -17037,7 +17029,7 @@
         <w:pStyle w:val="Overskrift3"/>
       </w:pPr>
       <w:bookmarkStart w:id="63" w:name="verktøy-og-reproduserbarhet"/>
-      <w:bookmarkStart w:id="64" w:name="_Toc230678441"/>
+      <w:bookmarkStart w:id="64" w:name="_Toc230679007"/>
       <w:bookmarkEnd w:id="61"/>
       <w:r>
         <w:t>5.6 Verktøy og reproduserbarhet</w:t>
@@ -17110,7 +17102,7 @@
         <w:pStyle w:val="Overskrift3"/>
       </w:pPr>
       <w:bookmarkStart w:id="65" w:name="antakelsessjekk-kompendiet-steg-2"/>
-      <w:bookmarkStart w:id="66" w:name="_Toc230678442"/>
+      <w:bookmarkStart w:id="66" w:name="_Toc230679008"/>
       <w:bookmarkEnd w:id="63"/>
       <w:r>
         <w:t>5.7 Antakelses</w:t>
@@ -17468,7 +17460,7 @@
         <w:rPr>
           <w:rFonts w:eastAsia="Times New Roman" w:cs="Times New Roman"/>
         </w:rPr>
-        <w:pict w14:anchorId="7ADB30A9">
+        <w:pict w14:anchorId="60230040">
           <v:rect id="_x0000_i1032" style="width:0;height:1.5pt" o:hralign="center" o:hrstd="t" o:hr="t"/>
         </w:pict>
       </w:r>
@@ -17478,7 +17470,7 @@
         <w:pStyle w:val="Overskrift2"/>
       </w:pPr>
       <w:bookmarkStart w:id="67" w:name="modell"/>
-      <w:bookmarkStart w:id="68" w:name="_Toc230678443"/>
+      <w:bookmarkStart w:id="68" w:name="_Toc230679009"/>
       <w:bookmarkEnd w:id="49"/>
       <w:bookmarkEnd w:id="65"/>
       <w:r>
@@ -17491,7 +17483,7 @@
         <w:pStyle w:val="Overskrift3"/>
       </w:pPr>
       <w:bookmarkStart w:id="69" w:name="målvariabel-og-tap"/>
-      <w:bookmarkStart w:id="70" w:name="_Toc230678444"/>
+      <w:bookmarkStart w:id="70" w:name="_Toc230679010"/>
       <w:r>
         <w:t>6.1 Mål</w:t>
       </w:r>
@@ -17623,7 +17615,7 @@
         <w:pStyle w:val="Overskrift3"/>
       </w:pPr>
       <w:bookmarkStart w:id="71" w:name="baselinemodeller"/>
-      <w:bookmarkStart w:id="72" w:name="_Toc230678445"/>
+      <w:bookmarkStart w:id="72" w:name="_Toc230679011"/>
       <w:bookmarkEnd w:id="69"/>
       <w:r>
         <w:t>6.2 Baseline</w:t>
@@ -17751,7 +17743,7 @@
         <w:pStyle w:val="Overskrift3"/>
       </w:pPr>
       <w:bookmarkStart w:id="73" w:name="hovedmodell-lightgbm-catboost-ensemble"/>
-      <w:bookmarkStart w:id="74" w:name="_Toc230678446"/>
+      <w:bookmarkStart w:id="74" w:name="_Toc230679012"/>
       <w:bookmarkEnd w:id="71"/>
       <w:r>
         <w:t>6.3 Hovedmodell — LightGBM + CatBoost ensemble</w:t>
@@ -18148,7 +18140,7 @@
         <w:pStyle w:val="Overskrift3"/>
       </w:pPr>
       <w:bookmarkStart w:id="75" w:name="kvantilmodell-og-konform-kalibrering"/>
-      <w:bookmarkStart w:id="76" w:name="_Toc230678447"/>
+      <w:bookmarkStart w:id="76" w:name="_Toc230679013"/>
       <w:bookmarkEnd w:id="73"/>
       <w:r>
         <w:t>6.4 Kvantil</w:t>
@@ -18232,7 +18224,7 @@
         <w:pStyle w:val="Overskrift3"/>
       </w:pPr>
       <w:bookmarkStart w:id="77" w:name="hybrid-kalibrering-på-anløpsnivå"/>
-      <w:bookmarkStart w:id="78" w:name="_Toc230678448"/>
+      <w:bookmarkStart w:id="78" w:name="_Toc230679014"/>
       <w:bookmarkEnd w:id="75"/>
       <w:r>
         <w:t>6.5 Hybrid kalibrering på anløpsnivå</w:t>
@@ -18612,7 +18604,7 @@
         <w:rPr>
           <w:rFonts w:eastAsia="Times New Roman" w:cs="Times New Roman"/>
         </w:rPr>
-        <w:pict w14:anchorId="45E6ABC5">
+        <w:pict w14:anchorId="39CD82B3">
           <v:rect id="_x0000_i1033" style="width:0;height:1.5pt" o:hralign="center" o:hrstd="t" o:hr="t"/>
         </w:pict>
       </w:r>
@@ -18622,7 +18614,7 @@
         <w:pStyle w:val="Overskrift2"/>
       </w:pPr>
       <w:bookmarkStart w:id="79" w:name="analyse"/>
-      <w:bookmarkStart w:id="80" w:name="_Toc230678449"/>
+      <w:bookmarkStart w:id="80" w:name="_Toc230679015"/>
       <w:bookmarkEnd w:id="67"/>
       <w:bookmarkEnd w:id="77"/>
       <w:r>
@@ -18703,7 +18695,7 @@
         <w:pStyle w:val="Overskrift3"/>
       </w:pPr>
       <w:bookmarkStart w:id="81" w:name="beskrivende-statistikk"/>
-      <w:bookmarkStart w:id="82" w:name="_Toc230678450"/>
+      <w:bookmarkStart w:id="82" w:name="_Toc230679016"/>
       <w:r>
         <w:t>7.1 Beskrivende statistikk</w:t>
       </w:r>
@@ -18720,7 +18712,7 @@
           <w:noProof/>
         </w:rPr>
         <w:drawing>
-          <wp:inline distT="0" distB="0" distL="0" distR="0" wp14:anchorId="3D587F74" wp14:editId="071E6BA5">
+          <wp:inline distT="0" distB="0" distL="0" distR="0" wp14:anchorId="1C1BD2A3" wp14:editId="726C873C">
             <wp:extent cx="5334000" cy="3288699"/>
             <wp:effectExtent l="0" t="0" r="0" b="0"/>
             <wp:docPr id="52" name="Picture" descr="Figur 7.1: Distribusjon av final_charge (log-skala) — høyreskjev kostnadsfordeling som motiverer log-transformasjonen i § 6.1"/>
@@ -18895,7 +18887,7 @@
           <w:noProof/>
         </w:rPr>
         <w:drawing>
-          <wp:inline distT="0" distB="0" distL="0" distR="0" wp14:anchorId="35145F00" wp14:editId="698D5678">
+          <wp:inline distT="0" distB="0" distL="0" distR="0" wp14:anchorId="488D08B3" wp14:editId="65939743">
             <wp:extent cx="5334000" cy="2389866"/>
             <wp:effectExtent l="0" t="0" r="0" b="0"/>
             <wp:docPr id="55" name="Picture" descr="Figur 7.2: Antall transaksjoner per havn og år (2020–2025) — viser trafikkvolum og datatilfang per havn"/>
@@ -19034,7 +19026,7 @@
           <w:noProof/>
         </w:rPr>
         <w:drawing>
-          <wp:inline distT="0" distB="0" distL="0" distR="0" wp14:anchorId="6E3B20C4" wp14:editId="6D6503F9">
+          <wp:inline distT="0" distB="0" distL="0" distR="0" wp14:anchorId="6A1ED62E" wp14:editId="3C0B91AE">
             <wp:extent cx="5334000" cy="2634650"/>
             <wp:effectExtent l="0" t="0" r="0" b="0"/>
             <wp:docPr id="58" name="Picture" descr="Figur 7.3: Kostnad per tjenestekategori, fordelt på størrelseskategori (Liten / Mellomstor / Stor)"/>
@@ -19160,7 +19152,7 @@
         <w:pStyle w:val="Overskrift3"/>
       </w:pPr>
       <w:bookmarkStart w:id="83" w:name="korrelasjoner-og-feature-importance"/>
-      <w:bookmarkStart w:id="84" w:name="_Toc230678451"/>
+      <w:bookmarkStart w:id="84" w:name="_Toc230679017"/>
       <w:bookmarkEnd w:id="81"/>
       <w:r>
         <w:t>7.2 Korrelasjoner og feature importance</w:t>
@@ -19178,7 +19170,7 @@
           <w:noProof/>
         </w:rPr>
         <w:drawing>
-          <wp:inline distT="0" distB="0" distL="0" distR="0" wp14:anchorId="57566290" wp14:editId="281018F0">
+          <wp:inline distT="0" distB="0" distL="0" distR="0" wp14:anchorId="22E09A6D" wp14:editId="1D9115C0">
             <wp:extent cx="5334000" cy="3294926"/>
             <wp:effectExtent l="0" t="0" r="0" b="0"/>
             <wp:docPr id="62" name="Picture" descr="Figur 7.4: Spearman-korrelasjon mellom numeriske features og log-kostnad — GT, LOA og fuel­konsum er moderat positivt korrelert"/>
@@ -19310,7 +19302,7 @@
           <w:noProof/>
         </w:rPr>
         <w:drawing>
-          <wp:inline distT="0" distB="0" distL="0" distR="0" wp14:anchorId="0C9974E0" wp14:editId="76256600">
+          <wp:inline distT="0" distB="0" distL="0" distR="0" wp14:anchorId="61FC2B88" wp14:editId="221EF6DF">
             <wp:extent cx="5334000" cy="3528031"/>
             <wp:effectExtent l="0" t="0" r="0" b="0"/>
             <wp:docPr id="65" name="Picture" descr="Figur 7.5: Top-15 feature importance fra LightGBM (gain-andel) — service_type og størrelse-baserte aggregat­statistikker dominerer"/>
@@ -19539,7 +19531,7 @@
         <w:pStyle w:val="Overskrift3"/>
       </w:pPr>
       <w:bookmarkStart w:id="85" w:name="shap-analyse"/>
-      <w:bookmarkStart w:id="86" w:name="_Toc230678452"/>
+      <w:bookmarkStart w:id="86" w:name="_Toc230679018"/>
       <w:bookmarkEnd w:id="83"/>
       <w:r>
         <w:t>7.3 SHAP-analyse</w:t>
@@ -19557,7 +19549,7 @@
           <w:noProof/>
         </w:rPr>
         <w:drawing>
-          <wp:inline distT="0" distB="0" distL="0" distR="0" wp14:anchorId="13C709C9" wp14:editId="55CF1A31">
+          <wp:inline distT="0" distB="0" distL="0" distR="0" wp14:anchorId="18F18329" wp14:editId="04416D93">
             <wp:extent cx="5334000" cy="3530676"/>
             <wp:effectExtent l="0" t="0" r="0" b="0"/>
             <wp:docPr id="69" name="Picture" descr="Figur 7.6: LightGBM gain-importance (fallback for SHAP) — relativ styrke per feature i ensemble­modellen"/>
@@ -19786,7 +19778,7 @@
           <w:noProof/>
         </w:rPr>
         <w:drawing>
-          <wp:inline distT="0" distB="0" distL="0" distR="0" wp14:anchorId="052CB028" wp14:editId="1E6EA6A8">
+          <wp:inline distT="0" distB="0" distL="0" distR="0" wp14:anchorId="5D156449" wp14:editId="18B53417">
             <wp:extent cx="5334000" cy="1660156"/>
             <wp:effectExtent l="0" t="0" r="0" b="0"/>
             <wp:docPr id="72" name="Picture" descr="Figur 7.7: Predikerte kostnader fordelt på GT (log-skala), tjenestekategori og ankomsthavn — viser monoton GT-effekt og tydelig havne­variasjon"/>
@@ -19989,7 +19981,7 @@
         <w:pStyle w:val="Overskrift3"/>
       </w:pPr>
       <w:bookmarkStart w:id="87" w:name="residualdiagnostikk"/>
-      <w:bookmarkStart w:id="88" w:name="_Toc230678453"/>
+      <w:bookmarkStart w:id="88" w:name="_Toc230679019"/>
       <w:bookmarkEnd w:id="85"/>
       <w:r>
         <w:t>7.4 Residual</w:t>
@@ -20011,7 +20003,7 @@
           <w:noProof/>
         </w:rPr>
         <w:drawing>
-          <wp:inline distT="0" distB="0" distL="0" distR="0" wp14:anchorId="15FC3062" wp14:editId="06D8DFAB">
+          <wp:inline distT="0" distB="0" distL="0" distR="0" wp14:anchorId="7A9C1B96" wp14:editId="51DB4366">
             <wp:extent cx="5334000" cy="2126429"/>
             <wp:effectExtent l="0" t="0" r="0" b="0"/>
             <wp:docPr id="76" name="Picture" descr="Figur 7.8: Residualplott (predikert vs. faktisk i log-rom) på valideringssettet (n = 490, 2024) — bias ≈ −0,20 indikerer systematisk overprediksjon for lave fakturaer"/>
@@ -20619,7 +20611,7 @@
         <w:rPr>
           <w:rFonts w:eastAsia="Times New Roman" w:cs="Times New Roman"/>
         </w:rPr>
-        <w:pict w14:anchorId="49096236">
+        <w:pict w14:anchorId="63B58E46">
           <v:rect id="_x0000_i1034" style="width:0;height:1.5pt" o:hralign="center" o:hrstd="t" o:hr="t"/>
         </w:pict>
       </w:r>
@@ -20629,7 +20621,7 @@
         <w:pStyle w:val="Overskrift2"/>
       </w:pPr>
       <w:bookmarkStart w:id="89" w:name="resultat"/>
-      <w:bookmarkStart w:id="90" w:name="_Toc230678454"/>
+      <w:bookmarkStart w:id="90" w:name="_Toc230679020"/>
       <w:bookmarkEnd w:id="79"/>
       <w:bookmarkEnd w:id="87"/>
       <w:r>
@@ -20642,7 +20634,7 @@
         <w:pStyle w:val="Overskrift3"/>
       </w:pPr>
       <w:bookmarkStart w:id="91" w:name="X9e63db4d73416036d6c4aff3da2d7ddb8b5d91f"/>
-      <w:bookmarkStart w:id="92" w:name="_Toc230678455"/>
+      <w:bookmarkStart w:id="92" w:name="_Toc230679021"/>
       <w:r>
         <w:t>8.1 Sammenligning av modeller på valideringssettet</w:t>
       </w:r>
@@ -21976,7 +21968,7 @@
         <w:pStyle w:val="Overskrift3"/>
       </w:pPr>
       <w:bookmarkStart w:id="93" w:name="endelig-evaluering-på-testsettet-2025"/>
-      <w:bookmarkStart w:id="94" w:name="_Toc230678456"/>
+      <w:bookmarkStart w:id="94" w:name="_Toc230679022"/>
       <w:bookmarkEnd w:id="91"/>
       <w:r>
         <w:t>8.1.1 Endelig evaluering på testsettet (2025)</w:t>
@@ -23124,7 +23116,7 @@
         <w:pStyle w:val="Overskrift3"/>
       </w:pPr>
       <w:bookmarkStart w:id="95" w:name="kvantildekning"/>
-      <w:bookmarkStart w:id="96" w:name="_Toc230678457"/>
+      <w:bookmarkStart w:id="96" w:name="_Toc230679023"/>
       <w:bookmarkEnd w:id="93"/>
       <w:r>
         <w:t>8.2 Kvantil</w:t>
@@ -23180,7 +23172,7 @@
         <w:pStyle w:val="Overskrift3"/>
       </w:pPr>
       <w:bookmarkStart w:id="97" w:name="hybridkalibrert-anløpsestimat-eksempler"/>
-      <w:bookmarkStart w:id="98" w:name="_Toc230678458"/>
+      <w:bookmarkStart w:id="98" w:name="_Toc230679024"/>
       <w:bookmarkEnd w:id="95"/>
       <w:r>
         <w:t>8.3 Hybrid</w:t>
@@ -25352,7 +25344,7 @@
         <w:pStyle w:val="Overskrift3"/>
       </w:pPr>
       <w:bookmarkStart w:id="99" w:name="operasjonell-ytelse"/>
-      <w:bookmarkStart w:id="100" w:name="_Toc230678459"/>
+      <w:bookmarkStart w:id="100" w:name="_Toc230679025"/>
       <w:bookmarkEnd w:id="97"/>
       <w:r>
         <w:t>8.4 Operasjonell ytelse</w:t>
@@ -25407,7 +25399,7 @@
         <w:rPr>
           <w:rFonts w:eastAsia="Times New Roman" w:cs="Times New Roman"/>
         </w:rPr>
-        <w:pict w14:anchorId="08098936">
+        <w:pict w14:anchorId="471FF4B0">
           <v:rect id="_x0000_i1035" style="width:0;height:1.5pt" o:hralign="center" o:hrstd="t" o:hr="t"/>
         </w:pict>
       </w:r>
@@ -25417,7 +25409,7 @@
         <w:pStyle w:val="Overskrift2"/>
       </w:pPr>
       <w:bookmarkStart w:id="101" w:name="diskusjon"/>
-      <w:bookmarkStart w:id="102" w:name="_Toc230678460"/>
+      <w:bookmarkStart w:id="102" w:name="_Toc230679026"/>
       <w:bookmarkEnd w:id="89"/>
       <w:bookmarkEnd w:id="99"/>
       <w:r>
@@ -25430,7 +25422,7 @@
         <w:pStyle w:val="Overskrift3"/>
       </w:pPr>
       <w:bookmarkStart w:id="103" w:name="tolkning-av-resultatene"/>
-      <w:bookmarkStart w:id="104" w:name="_Toc230678461"/>
+      <w:bookmarkStart w:id="104" w:name="_Toc230679027"/>
       <w:r>
         <w:t>9.1 Tolkning av resultatene</w:t>
       </w:r>
@@ -25604,7 +25596,7 @@
         <w:pStyle w:val="Overskrift3"/>
       </w:pPr>
       <w:bookmarkStart w:id="105" w:name="X244671d3f5a9d81faac214b94d413d8f6763369"/>
-      <w:bookmarkStart w:id="106" w:name="_Toc230678462"/>
+      <w:bookmarkStart w:id="106" w:name="_Toc230679028"/>
       <w:bookmarkEnd w:id="103"/>
       <w:r>
         <w:t>9.2 Forholdet mellom ensemble og enkelt</w:t>
@@ -25845,7 +25837,7 @@
         <w:pStyle w:val="Overskrift3"/>
       </w:pPr>
       <w:bookmarkStart w:id="107" w:name="modellens-styrker"/>
-      <w:bookmarkStart w:id="108" w:name="_Toc230678463"/>
+      <w:bookmarkStart w:id="108" w:name="_Toc230679029"/>
       <w:bookmarkEnd w:id="105"/>
       <w:r>
         <w:t>9.3 Modellens styrker</w:t>
@@ -25961,7 +25953,7 @@
         <w:pStyle w:val="Overskrift3"/>
       </w:pPr>
       <w:bookmarkStart w:id="109" w:name="X56aa68e323ecedcef833e61fdd58166787950c3"/>
-      <w:bookmarkStart w:id="110" w:name="_Toc230678464"/>
+      <w:bookmarkStart w:id="110" w:name="_Toc230679030"/>
       <w:bookmarkEnd w:id="107"/>
       <w:r>
         <w:t>9.4 Modellens svakheter — kritisk drøfting og forsvar</w:t>
@@ -26976,7 +26968,7 @@
         <w:pStyle w:val="Overskrift3"/>
       </w:pPr>
       <w:bookmarkStart w:id="111" w:name="funn-fra-brukertest-mai-2026"/>
-      <w:bookmarkStart w:id="112" w:name="_Toc230678465"/>
+      <w:bookmarkStart w:id="112" w:name="_Toc230679031"/>
       <w:bookmarkEnd w:id="109"/>
       <w:r>
         <w:t>9.5 Funn fra brukertest mai 2026</w:t>
@@ -26992,7 +26984,7 @@
         <w:rPr>
           <w:rFonts w:eastAsia="Times New Roman" w:cs="Times New Roman"/>
         </w:rPr>
-        <w:t>En end-to-end brukertest med agency-manageren avdekket syv systematiske avvik. Hvert er adressert som modell</w:t>
+        <w:t>En end-to-end brukertest med Operations manager avdekket syv systematiske avvik. Hvert er adressert som modell</w:t>
       </w:r>
       <w:r>
         <w:rPr>
@@ -27692,7 +27684,7 @@
         <w:rPr>
           <w:rFonts w:eastAsia="Times New Roman" w:cs="Times New Roman"/>
         </w:rPr>
-        <w:t xml:space="preserve">Manageren spurte: </w:t>
+        <w:t xml:space="preserve">Operations manager spurte: </w:t>
       </w:r>
       <w:r>
         <w:rPr>
@@ -27862,7 +27854,7 @@
         <w:pStyle w:val="Overskrift3"/>
       </w:pPr>
       <w:bookmarkStart w:id="120" w:name="validitet-og-generaliserbarhet"/>
-      <w:bookmarkStart w:id="121" w:name="_Toc230678466"/>
+      <w:bookmarkStart w:id="121" w:name="_Toc230679032"/>
       <w:bookmarkEnd w:id="111"/>
       <w:bookmarkEnd w:id="119"/>
       <w:r>
@@ -28475,7 +28467,7 @@
         <w:pStyle w:val="Overskrift3"/>
       </w:pPr>
       <w:bookmarkStart w:id="122" w:name="praktiske-implikasjoner"/>
-      <w:bookmarkStart w:id="123" w:name="_Toc230678467"/>
+      <w:bookmarkStart w:id="123" w:name="_Toc230679033"/>
       <w:bookmarkEnd w:id="120"/>
       <w:r>
         <w:t>9.7 Praktiske implikasjoner</w:t>
@@ -28561,7 +28553,7 @@
         <w:pStyle w:val="Overskrift3"/>
       </w:pPr>
       <w:bookmarkStart w:id="124" w:name="etiske-og-personvernmessige-hensyn"/>
-      <w:bookmarkStart w:id="125" w:name="_Toc230678468"/>
+      <w:bookmarkStart w:id="125" w:name="_Toc230679034"/>
       <w:bookmarkEnd w:id="122"/>
       <w:r>
         <w:t>9.8 Etiske og personvernmessige hensyn</w:t>
@@ -28635,7 +28627,7 @@
         <w:rPr>
           <w:rFonts w:eastAsia="Times New Roman" w:cs="Times New Roman"/>
         </w:rPr>
-        <w:pict w14:anchorId="70E19D0E">
+        <w:pict w14:anchorId="2FFAD4F0">
           <v:rect id="_x0000_i1036" style="width:0;height:1.5pt" o:hralign="center" o:hrstd="t" o:hr="t"/>
         </w:pict>
       </w:r>
@@ -28645,7 +28637,7 @@
         <w:pStyle w:val="Overskrift2"/>
       </w:pPr>
       <w:bookmarkStart w:id="126" w:name="konklusjon"/>
-      <w:bookmarkStart w:id="127" w:name="_Toc230678469"/>
+      <w:bookmarkStart w:id="127" w:name="_Toc230679035"/>
       <w:bookmarkEnd w:id="101"/>
       <w:bookmarkEnd w:id="124"/>
       <w:r>
@@ -28931,7 +28923,7 @@
         <w:pStyle w:val="Overskrift2"/>
       </w:pPr>
       <w:bookmarkStart w:id="128" w:name="bibliografi"/>
-      <w:bookmarkStart w:id="129" w:name="_Toc230678470"/>
+      <w:bookmarkStart w:id="129" w:name="_Toc230679036"/>
       <w:bookmarkEnd w:id="126"/>
       <w:r>
         <w:t>11. Bibliografi</w:t>
@@ -29414,7 +29406,7 @@
         <w:rPr>
           <w:rFonts w:eastAsia="Times New Roman" w:cs="Times New Roman"/>
         </w:rPr>
-        <w:pict w14:anchorId="1A530405">
+        <w:pict w14:anchorId="44C7BC3A">
           <v:rect id="_x0000_i1037" style="width:0;height:1.5pt" o:hralign="center" o:hrstd="t" o:hr="t"/>
         </w:pict>
       </w:r>
@@ -29424,7 +29416,7 @@
         <w:pStyle w:val="Overskrift2"/>
       </w:pPr>
       <w:bookmarkStart w:id="130" w:name="vedlegg"/>
-      <w:bookmarkStart w:id="131" w:name="_Toc230678471"/>
+      <w:bookmarkStart w:id="131" w:name="_Toc230679037"/>
       <w:bookmarkEnd w:id="128"/>
       <w:r>
         <w:t>Vedlegg</w:t>
@@ -29712,7 +29704,7 @@
         <w:pStyle w:val="Overskrift3"/>
       </w:pPr>
       <w:bookmarkStart w:id="132" w:name="Xe1f01a8cc6b3208ae7fb51104f9d9c075e3eeb5"/>
-      <w:bookmarkStart w:id="133" w:name="_Toc230678472"/>
+      <w:bookmarkStart w:id="133" w:name="_Toc230679038"/>
       <w:r>
         <w:t xml:space="preserve">Vedlegg E. Foreslått rubrikk for </w:t>
       </w:r>
@@ -30429,7 +30421,7 @@
   <w:abstractNum w:abstractNumId="0" w15:restartNumberingAfterBreak="0">
     <w:nsid w:val="0000A990"/>
     <w:multiLevelType w:val="multilevel"/>
-    <w:tmpl w:val="584601B8"/>
+    <w:tmpl w:val="B270F458"/>
     <w:lvl w:ilvl="0">
       <w:numFmt w:val="bullet"/>
       <w:lvlText w:val=" "/>
@@ -30506,7 +30498,7 @@
   <w:abstractNum w:abstractNumId="1" w15:restartNumberingAfterBreak="0">
     <w:nsid w:val="0000A991"/>
     <w:multiLevelType w:val="multilevel"/>
-    <w:tmpl w:val="F1DAB9E0"/>
+    <w:tmpl w:val="60C6F7F2"/>
     <w:lvl w:ilvl="0">
       <w:numFmt w:val="bullet"/>
       <w:lvlText w:val=""/>
@@ -30610,7 +30602,7 @@
   <w:abstractNum w:abstractNumId="2" w15:restartNumberingAfterBreak="0">
     <w:nsid w:val="0000A993"/>
     <w:multiLevelType w:val="multilevel"/>
-    <w:tmpl w:val="4260CB78"/>
+    <w:tmpl w:val="7C347E30"/>
     <w:lvl w:ilvl="0">
       <w:numFmt w:val="bullet"/>
       <w:lvlText w:val="☒"/>
@@ -30687,7 +30679,7 @@
   <w:abstractNum w:abstractNumId="3" w15:restartNumberingAfterBreak="0">
     <w:nsid w:val="00A99411"/>
     <w:multiLevelType w:val="multilevel"/>
-    <w:tmpl w:val="DCA8AF3A"/>
+    <w:tmpl w:val="8C4CE054"/>
     <w:lvl w:ilvl="0">
       <w:start w:val="1"/>
       <w:numFmt w:val="decimal"/>
@@ -30770,28 +30762,28 @@
       </w:pPr>
     </w:lvl>
   </w:abstractNum>
-  <w:num w:numId="1" w16cid:durableId="1740976091">
+  <w:num w:numId="1" w16cid:durableId="2078700833">
     <w:abstractNumId w:val="0"/>
   </w:num>
-  <w:num w:numId="2" w16cid:durableId="1450659573">
+  <w:num w:numId="2" w16cid:durableId="1084909709">
     <w:abstractNumId w:val="2"/>
   </w:num>
-  <w:num w:numId="3" w16cid:durableId="1596135499">
+  <w:num w:numId="3" w16cid:durableId="1380548354">
     <w:abstractNumId w:val="2"/>
   </w:num>
-  <w:num w:numId="4" w16cid:durableId="1658268971">
+  <w:num w:numId="4" w16cid:durableId="2136294886">
     <w:abstractNumId w:val="2"/>
   </w:num>
-  <w:num w:numId="5" w16cid:durableId="1023822909">
+  <w:num w:numId="5" w16cid:durableId="2136559776">
     <w:abstractNumId w:val="2"/>
   </w:num>
-  <w:num w:numId="6" w16cid:durableId="92866564">
+  <w:num w:numId="6" w16cid:durableId="424348342">
     <w:abstractNumId w:val="2"/>
   </w:num>
-  <w:num w:numId="7" w16cid:durableId="1997104122">
+  <w:num w:numId="7" w16cid:durableId="527138484">
     <w:abstractNumId w:val="2"/>
   </w:num>
-  <w:num w:numId="8" w16cid:durableId="1737242222">
+  <w:num w:numId="8" w16cid:durableId="344945906">
     <w:abstractNumId w:val="3"/>
     <w:lvlOverride w:ilvl="0">
       <w:startOverride w:val="1"/>
@@ -30821,13 +30813,13 @@
       <w:startOverride w:val="1"/>
     </w:lvlOverride>
   </w:num>
-  <w:num w:numId="9" w16cid:durableId="1389718813">
+  <w:num w:numId="9" w16cid:durableId="524056611">
     <w:abstractNumId w:val="1"/>
   </w:num>
-  <w:num w:numId="10" w16cid:durableId="1159465882">
+  <w:num w:numId="10" w16cid:durableId="791290293">
     <w:abstractNumId w:val="1"/>
   </w:num>
-  <w:num w:numId="11" w16cid:durableId="1292519554">
+  <w:num w:numId="11" w16cid:durableId="1582326614">
     <w:abstractNumId w:val="3"/>
     <w:lvlOverride w:ilvl="0">
       <w:startOverride w:val="1"/>
@@ -30857,7 +30849,7 @@
       <w:startOverride w:val="1"/>
     </w:lvlOverride>
   </w:num>
-  <w:num w:numId="12" w16cid:durableId="67190142">
+  <w:num w:numId="12" w16cid:durableId="48039336">
     <w:abstractNumId w:val="3"/>
     <w:lvlOverride w:ilvl="0">
       <w:startOverride w:val="1"/>
@@ -30887,10 +30879,10 @@
       <w:startOverride w:val="1"/>
     </w:lvlOverride>
   </w:num>
-  <w:num w:numId="13" w16cid:durableId="1289051958">
+  <w:num w:numId="13" w16cid:durableId="1732264912">
     <w:abstractNumId w:val="1"/>
   </w:num>
-  <w:num w:numId="14" w16cid:durableId="47384090">
+  <w:num w:numId="14" w16cid:durableId="1257053751">
     <w:abstractNumId w:val="3"/>
     <w:lvlOverride w:ilvl="0">
       <w:startOverride w:val="1"/>
@@ -30920,10 +30912,10 @@
       <w:startOverride w:val="1"/>
     </w:lvlOverride>
   </w:num>
-  <w:num w:numId="15" w16cid:durableId="1417555689">
+  <w:num w:numId="15" w16cid:durableId="584849583">
     <w:abstractNumId w:val="1"/>
   </w:num>
-  <w:num w:numId="16" w16cid:durableId="1161115897">
+  <w:num w:numId="16" w16cid:durableId="686177684">
     <w:abstractNumId w:val="3"/>
     <w:lvlOverride w:ilvl="0">
       <w:startOverride w:val="1"/>
@@ -30953,10 +30945,10 @@
       <w:startOverride w:val="1"/>
     </w:lvlOverride>
   </w:num>
-  <w:num w:numId="17" w16cid:durableId="715469189">
+  <w:num w:numId="17" w16cid:durableId="351955708">
     <w:abstractNumId w:val="1"/>
   </w:num>
-  <w:num w:numId="18" w16cid:durableId="210919402">
+  <w:num w:numId="18" w16cid:durableId="1055081049">
     <w:abstractNumId w:val="3"/>
     <w:lvlOverride w:ilvl="0">
       <w:startOverride w:val="1"/>
@@ -30986,10 +30978,10 @@
       <w:startOverride w:val="1"/>
     </w:lvlOverride>
   </w:num>
-  <w:num w:numId="19" w16cid:durableId="981155741">
+  <w:num w:numId="19" w16cid:durableId="1002733558">
     <w:abstractNumId w:val="1"/>
   </w:num>
-  <w:num w:numId="20" w16cid:durableId="1807627145">
+  <w:num w:numId="20" w16cid:durableId="1890528103">
     <w:abstractNumId w:val="3"/>
     <w:lvlOverride w:ilvl="0">
       <w:startOverride w:val="1"/>
@@ -31019,7 +31011,7 @@
       <w:startOverride w:val="1"/>
     </w:lvlOverride>
   </w:num>
-  <w:num w:numId="21" w16cid:durableId="1161652464">
+  <w:num w:numId="21" w16cid:durableId="570164052">
     <w:abstractNumId w:val="3"/>
     <w:lvlOverride w:ilvl="0">
       <w:startOverride w:val="1"/>
@@ -31049,16 +31041,16 @@
       <w:startOverride w:val="1"/>
     </w:lvlOverride>
   </w:num>
-  <w:num w:numId="22" w16cid:durableId="1734935733">
+  <w:num w:numId="22" w16cid:durableId="1475681339">
     <w:abstractNumId w:val="1"/>
   </w:num>
-  <w:num w:numId="23" w16cid:durableId="745879654">
+  <w:num w:numId="23" w16cid:durableId="1780372313">
     <w:abstractNumId w:val="1"/>
   </w:num>
-  <w:num w:numId="24" w16cid:durableId="1074202257">
+  <w:num w:numId="24" w16cid:durableId="579994982">
     <w:abstractNumId w:val="1"/>
   </w:num>
-  <w:num w:numId="25" w16cid:durableId="1791588303">
+  <w:num w:numId="25" w16cid:durableId="515657021">
     <w:abstractNumId w:val="1"/>
   </w:num>
 </w:numbering>
@@ -32286,7 +32278,7 @@
     <w:next w:val="Normal"/>
     <w:autoRedefine/>
     <w:uiPriority w:val="39"/>
-    <w:rsid w:val="0063261F"/>
+    <w:rsid w:val="00826A15"/>
     <w:pPr>
       <w:spacing w:after="100"/>
       <w:ind w:left="240"/>
@@ -32298,7 +32290,7 @@
     <w:next w:val="Normal"/>
     <w:autoRedefine/>
     <w:uiPriority w:val="39"/>
-    <w:rsid w:val="0063261F"/>
+    <w:rsid w:val="00826A15"/>
     <w:pPr>
       <w:spacing w:after="100"/>
       <w:ind w:left="480"/>

</xml_diff>